<commit_message>
Day 9 Part 2: Learn the use of useMemo
</commit_message>
<xml_diff>
--- a/Learning React.docx
+++ b/Learning React.docx
@@ -8,14 +8,12 @@
         <w:rPr>
           <w:b/>
           <w:bCs/>
-          <w:lang w:val="en-PK"/>
         </w:rPr>
       </w:pPr>
       <w:r>
         <w:rPr>
           <w:b/>
           <w:bCs/>
-          <w:lang w:val="en-PK"/>
         </w:rPr>
         <w:t>Day 1: React Basics</w:t>
       </w:r>
@@ -27,14 +25,8 @@
           <w:numId w:val="1"/>
         </w:numPr>
         <w:spacing w:line="240" w:lineRule="auto"/>
-        <w:rPr>
-          <w:lang w:val="en-PK"/>
-        </w:rPr>
-      </w:pPr>
-      <w:r>
-        <w:rPr>
-          <w:lang w:val="en-PK"/>
-        </w:rPr>
+      </w:pPr>
+      <w:r>
         <w:t>What React is and how it works</w:t>
       </w:r>
     </w:p>
@@ -45,14 +37,8 @@
           <w:numId w:val="1"/>
         </w:numPr>
         <w:spacing w:line="240" w:lineRule="auto"/>
-        <w:rPr>
-          <w:lang w:val="en-PK"/>
-        </w:rPr>
-      </w:pPr>
-      <w:r>
-        <w:rPr>
-          <w:lang w:val="en-PK"/>
-        </w:rPr>
+      </w:pPr>
+      <w:r>
         <w:t>Understanding JSX</w:t>
       </w:r>
     </w:p>
@@ -63,14 +49,8 @@
           <w:numId w:val="1"/>
         </w:numPr>
         <w:spacing w:line="240" w:lineRule="auto"/>
-        <w:rPr>
-          <w:lang w:val="en-PK"/>
-        </w:rPr>
-      </w:pPr>
-      <w:r>
-        <w:rPr>
-          <w:lang w:val="en-PK"/>
-        </w:rPr>
+      </w:pPr>
+      <w:r>
         <w:t>Creating functional components</w:t>
       </w:r>
     </w:p>
@@ -81,14 +61,8 @@
           <w:numId w:val="1"/>
         </w:numPr>
         <w:spacing w:line="240" w:lineRule="auto"/>
-        <w:rPr>
-          <w:lang w:val="en-PK"/>
-        </w:rPr>
-      </w:pPr>
-      <w:r>
-        <w:rPr>
-          <w:lang w:val="en-PK"/>
-        </w:rPr>
+      </w:pPr>
+      <w:r>
         <w:t>Merging multiple components into a main component</w:t>
       </w:r>
     </w:p>
@@ -99,14 +73,8 @@
           <w:numId w:val="1"/>
         </w:numPr>
         <w:spacing w:line="240" w:lineRule="auto"/>
-        <w:rPr>
-          <w:lang w:val="en-PK"/>
-        </w:rPr>
-      </w:pPr>
-      <w:r>
-        <w:rPr>
-          <w:lang w:val="en-PK"/>
-        </w:rPr>
+      </w:pPr>
+      <w:r>
         <w:t>Understanding component structure</w:t>
       </w:r>
     </w:p>
@@ -117,14 +85,8 @@
           <w:numId w:val="1"/>
         </w:numPr>
         <w:spacing w:line="240" w:lineRule="auto"/>
-        <w:rPr>
-          <w:lang w:val="en-PK"/>
-        </w:rPr>
-      </w:pPr>
-      <w:r>
-        <w:rPr>
-          <w:lang w:val="en-PK"/>
-        </w:rPr>
+      </w:pPr>
+      <w:r>
         <w:t>Learning component reusability</w:t>
       </w:r>
     </w:p>
@@ -134,14 +96,12 @@
         <w:rPr>
           <w:b/>
           <w:bCs/>
-          <w:lang w:val="en-PK"/>
         </w:rPr>
       </w:pPr>
       <w:r>
         <w:rPr>
           <w:b/>
           <w:bCs/>
-          <w:lang w:val="en-PK"/>
         </w:rPr>
         <w:t>Day 2: Styling, Functions &amp; JavaScript Concepts in React</w:t>
       </w:r>
@@ -153,14 +113,8 @@
           <w:numId w:val="2"/>
         </w:numPr>
         <w:spacing w:line="240" w:lineRule="auto"/>
-        <w:rPr>
-          <w:lang w:val="en-PK"/>
-        </w:rPr>
-      </w:pPr>
-      <w:r>
-        <w:rPr>
-          <w:lang w:val="en-PK"/>
-        </w:rPr>
+      </w:pPr>
+      <w:r>
         <w:t>Styling in JSX</w:t>
       </w:r>
     </w:p>
@@ -171,14 +125,8 @@
           <w:numId w:val="2"/>
         </w:numPr>
         <w:spacing w:line="240" w:lineRule="auto"/>
-        <w:rPr>
-          <w:lang w:val="en-PK"/>
-        </w:rPr>
-      </w:pPr>
-      <w:r>
-        <w:rPr>
-          <w:lang w:val="en-PK"/>
-        </w:rPr>
+      </w:pPr>
+      <w:r>
         <w:t>Inline styling</w:t>
       </w:r>
     </w:p>
@@ -189,14 +137,8 @@
           <w:numId w:val="2"/>
         </w:numPr>
         <w:spacing w:line="240" w:lineRule="auto"/>
-        <w:rPr>
-          <w:lang w:val="en-PK"/>
-        </w:rPr>
-      </w:pPr>
-      <w:r>
-        <w:rPr>
-          <w:lang w:val="en-PK"/>
-        </w:rPr>
+      </w:pPr>
+      <w:r>
         <w:t>Internal styling</w:t>
       </w:r>
     </w:p>
@@ -207,14 +149,8 @@
           <w:numId w:val="2"/>
         </w:numPr>
         <w:spacing w:line="240" w:lineRule="auto"/>
-        <w:rPr>
-          <w:lang w:val="en-PK"/>
-        </w:rPr>
-      </w:pPr>
-      <w:r>
-        <w:rPr>
-          <w:lang w:val="en-PK"/>
-        </w:rPr>
+      </w:pPr>
+      <w:r>
         <w:t>External CSS styling</w:t>
       </w:r>
     </w:p>
@@ -225,14 +161,8 @@
           <w:numId w:val="2"/>
         </w:numPr>
         <w:spacing w:line="240" w:lineRule="auto"/>
-        <w:rPr>
-          <w:lang w:val="en-PK"/>
-        </w:rPr>
-      </w:pPr>
-      <w:r>
-        <w:rPr>
-          <w:lang w:val="en-PK"/>
-        </w:rPr>
+      </w:pPr>
+      <w:r>
         <w:t>Applying dynamic styles</w:t>
       </w:r>
     </w:p>
@@ -243,14 +173,8 @@
           <w:numId w:val="2"/>
         </w:numPr>
         <w:spacing w:line="240" w:lineRule="auto"/>
-        <w:rPr>
-          <w:lang w:val="en-PK"/>
-        </w:rPr>
-      </w:pPr>
-      <w:r>
-        <w:rPr>
-          <w:lang w:val="en-PK"/>
-        </w:rPr>
+      </w:pPr>
+      <w:r>
         <w:t>Functions &amp; Events</w:t>
       </w:r>
     </w:p>
@@ -261,14 +185,8 @@
           <w:numId w:val="2"/>
         </w:numPr>
         <w:spacing w:line="240" w:lineRule="auto"/>
-        <w:rPr>
-          <w:lang w:val="en-PK"/>
-        </w:rPr>
-      </w:pPr>
-      <w:r>
-        <w:rPr>
-          <w:lang w:val="en-PK"/>
-        </w:rPr>
+      </w:pPr>
+      <w:r>
         <w:t>Normal functions</w:t>
       </w:r>
     </w:p>
@@ -279,14 +197,8 @@
           <w:numId w:val="2"/>
         </w:numPr>
         <w:spacing w:line="240" w:lineRule="auto"/>
-        <w:rPr>
-          <w:lang w:val="en-PK"/>
-        </w:rPr>
-      </w:pPr>
-      <w:r>
-        <w:rPr>
-          <w:lang w:val="en-PK"/>
-        </w:rPr>
+      </w:pPr>
+      <w:r>
         <w:t>Arrow functions</w:t>
       </w:r>
     </w:p>
@@ -297,14 +209,8 @@
           <w:numId w:val="2"/>
         </w:numPr>
         <w:spacing w:line="240" w:lineRule="auto"/>
-        <w:rPr>
-          <w:lang w:val="en-PK"/>
-        </w:rPr>
-      </w:pPr>
-      <w:r>
-        <w:rPr>
-          <w:lang w:val="en-PK"/>
-        </w:rPr>
+      </w:pPr>
+      <w:r>
         <w:t>Nested functions</w:t>
       </w:r>
     </w:p>
@@ -315,14 +221,8 @@
           <w:numId w:val="2"/>
         </w:numPr>
         <w:spacing w:line="240" w:lineRule="auto"/>
-        <w:rPr>
-          <w:lang w:val="en-PK"/>
-        </w:rPr>
-      </w:pPr>
-      <w:r>
-        <w:rPr>
-          <w:lang w:val="en-PK"/>
-        </w:rPr>
+      </w:pPr>
+      <w:r>
         <w:t>Handling events</w:t>
       </w:r>
     </w:p>
@@ -333,14 +233,8 @@
           <w:numId w:val="2"/>
         </w:numPr>
         <w:spacing w:line="240" w:lineRule="auto"/>
-        <w:rPr>
-          <w:lang w:val="en-PK"/>
-        </w:rPr>
-      </w:pPr>
-      <w:r>
-        <w:rPr>
-          <w:lang w:val="en-PK"/>
-        </w:rPr>
+      </w:pPr>
+      <w:r>
         <w:t>Using multiple event handlers</w:t>
       </w:r>
     </w:p>
@@ -351,14 +245,8 @@
           <w:numId w:val="2"/>
         </w:numPr>
         <w:spacing w:line="240" w:lineRule="auto"/>
-        <w:rPr>
-          <w:lang w:val="en-PK"/>
-        </w:rPr>
-      </w:pPr>
-      <w:r>
-        <w:rPr>
-          <w:lang w:val="en-PK"/>
-        </w:rPr>
+      </w:pPr>
+      <w:r>
         <w:t>Objects &amp; Classes</w:t>
       </w:r>
     </w:p>
@@ -369,14 +257,8 @@
           <w:numId w:val="2"/>
         </w:numPr>
         <w:spacing w:line="240" w:lineRule="auto"/>
-        <w:rPr>
-          <w:lang w:val="en-PK"/>
-        </w:rPr>
-      </w:pPr>
-      <w:r>
-        <w:rPr>
-          <w:lang w:val="en-PK"/>
-        </w:rPr>
+      </w:pPr>
+      <w:r>
         <w:t>Creating and using objects</w:t>
       </w:r>
     </w:p>
@@ -387,14 +269,8 @@
           <w:numId w:val="2"/>
         </w:numPr>
         <w:spacing w:line="240" w:lineRule="auto"/>
-        <w:rPr>
-          <w:lang w:val="en-PK"/>
-        </w:rPr>
-      </w:pPr>
-      <w:r>
-        <w:rPr>
-          <w:lang w:val="en-PK"/>
-        </w:rPr>
+      </w:pPr>
+      <w:r>
         <w:t>Basics of classes</w:t>
       </w:r>
     </w:p>
@@ -405,14 +281,8 @@
           <w:numId w:val="2"/>
         </w:numPr>
         <w:spacing w:line="240" w:lineRule="auto"/>
-        <w:rPr>
-          <w:lang w:val="en-PK"/>
-        </w:rPr>
-      </w:pPr>
-      <w:r>
-        <w:rPr>
-          <w:lang w:val="en-PK"/>
-        </w:rPr>
+      </w:pPr>
+      <w:r>
         <w:t>Using objects and classes inside React components</w:t>
       </w:r>
     </w:p>
@@ -422,14 +292,12 @@
         <w:rPr>
           <w:b/>
           <w:bCs/>
-          <w:lang w:val="en-PK"/>
         </w:rPr>
       </w:pPr>
       <w:r>
         <w:rPr>
           <w:b/>
           <w:bCs/>
-          <w:lang w:val="en-PK"/>
         </w:rPr>
         <w:t>Day 3: Conditional Rendering in React</w:t>
       </w:r>
@@ -441,14 +309,8 @@
           <w:numId w:val="3"/>
         </w:numPr>
         <w:spacing w:line="240" w:lineRule="auto"/>
-        <w:rPr>
-          <w:lang w:val="en-PK"/>
-        </w:rPr>
-      </w:pPr>
-      <w:r>
-        <w:rPr>
-          <w:lang w:val="en-PK"/>
-        </w:rPr>
+      </w:pPr>
+      <w:r>
         <w:t>Using if/else statements</w:t>
       </w:r>
     </w:p>
@@ -459,14 +321,8 @@
           <w:numId w:val="3"/>
         </w:numPr>
         <w:spacing w:line="240" w:lineRule="auto"/>
-        <w:rPr>
-          <w:lang w:val="en-PK"/>
-        </w:rPr>
-      </w:pPr>
-      <w:r>
-        <w:rPr>
-          <w:lang w:val="en-PK"/>
-        </w:rPr>
+      </w:pPr>
+      <w:r>
         <w:t>Using switch statements</w:t>
       </w:r>
     </w:p>
@@ -477,14 +333,8 @@
           <w:numId w:val="3"/>
         </w:numPr>
         <w:spacing w:line="240" w:lineRule="auto"/>
-        <w:rPr>
-          <w:lang w:val="en-PK"/>
-        </w:rPr>
-      </w:pPr>
-      <w:r>
-        <w:rPr>
-          <w:lang w:val="en-PK"/>
-        </w:rPr>
+      </w:pPr>
+      <w:r>
         <w:t>Using ternary operators</w:t>
       </w:r>
     </w:p>
@@ -495,14 +345,8 @@
           <w:numId w:val="3"/>
         </w:numPr>
         <w:spacing w:line="240" w:lineRule="auto"/>
-        <w:rPr>
-          <w:lang w:val="en-PK"/>
-        </w:rPr>
-      </w:pPr>
-      <w:r>
-        <w:rPr>
-          <w:lang w:val="en-PK"/>
-        </w:rPr>
+      </w:pPr>
+      <w:r>
         <w:t>Rendering different UI based on conditions</w:t>
       </w:r>
     </w:p>
@@ -513,14 +357,8 @@
           <w:numId w:val="3"/>
         </w:numPr>
         <w:spacing w:line="240" w:lineRule="auto"/>
-        <w:rPr>
-          <w:lang w:val="en-PK"/>
-        </w:rPr>
-      </w:pPr>
-      <w:r>
-        <w:rPr>
-          <w:lang w:val="en-PK"/>
-        </w:rPr>
+      </w:pPr>
+      <w:r>
         <w:t>Practical conditional rendering examples</w:t>
       </w:r>
     </w:p>
@@ -530,14 +368,12 @@
         <w:rPr>
           <w:b/>
           <w:bCs/>
-          <w:lang w:val="en-PK"/>
         </w:rPr>
       </w:pPr>
       <w:r>
         <w:rPr>
           <w:b/>
           <w:bCs/>
-          <w:lang w:val="en-PK"/>
         </w:rPr>
         <w:t>Day 4: Props &amp; State Management</w:t>
       </w:r>
@@ -549,14 +385,8 @@
           <w:numId w:val="4"/>
         </w:numPr>
         <w:spacing w:line="240" w:lineRule="auto"/>
-        <w:rPr>
-          <w:lang w:val="en-PK"/>
-        </w:rPr>
-      </w:pPr>
-      <w:r>
-        <w:rPr>
-          <w:lang w:val="en-PK"/>
-        </w:rPr>
+      </w:pPr>
+      <w:r>
         <w:t>Props in React</w:t>
       </w:r>
     </w:p>
@@ -567,14 +397,8 @@
           <w:numId w:val="4"/>
         </w:numPr>
         <w:spacing w:line="240" w:lineRule="auto"/>
-        <w:rPr>
-          <w:lang w:val="en-PK"/>
-        </w:rPr>
-      </w:pPr>
-      <w:r>
-        <w:rPr>
-          <w:lang w:val="en-PK"/>
-        </w:rPr>
+      </w:pPr>
+      <w:r>
         <w:lastRenderedPageBreak/>
         <w:t>Three different ways to pass props</w:t>
       </w:r>
@@ -586,14 +410,8 @@
           <w:numId w:val="4"/>
         </w:numPr>
         <w:spacing w:line="240" w:lineRule="auto"/>
-        <w:rPr>
-          <w:lang w:val="en-PK"/>
-        </w:rPr>
-      </w:pPr>
-      <w:r>
-        <w:rPr>
-          <w:lang w:val="en-PK"/>
-        </w:rPr>
+      </w:pPr>
+      <w:r>
         <w:t>Setting default props values</w:t>
       </w:r>
     </w:p>
@@ -604,14 +422,8 @@
           <w:numId w:val="4"/>
         </w:numPr>
         <w:spacing w:line="240" w:lineRule="auto"/>
-        <w:rPr>
-          <w:lang w:val="en-PK"/>
-        </w:rPr>
-      </w:pPr>
-      <w:r>
-        <w:rPr>
-          <w:lang w:val="en-PK"/>
-        </w:rPr>
+      </w:pPr>
+      <w:r>
         <w:t>Passing objects as props</w:t>
       </w:r>
     </w:p>
@@ -622,14 +434,8 @@
           <w:numId w:val="4"/>
         </w:numPr>
         <w:spacing w:line="240" w:lineRule="auto"/>
-        <w:rPr>
-          <w:lang w:val="en-PK"/>
-        </w:rPr>
-      </w:pPr>
-      <w:r>
-        <w:rPr>
-          <w:lang w:val="en-PK"/>
-        </w:rPr>
+      </w:pPr>
+      <w:r>
         <w:t>Passing classes as props</w:t>
       </w:r>
     </w:p>
@@ -640,14 +446,8 @@
           <w:numId w:val="4"/>
         </w:numPr>
         <w:spacing w:line="240" w:lineRule="auto"/>
-        <w:rPr>
-          <w:lang w:val="en-PK"/>
-        </w:rPr>
-      </w:pPr>
-      <w:r>
-        <w:rPr>
-          <w:lang w:val="en-PK"/>
-        </w:rPr>
+      </w:pPr>
+      <w:r>
         <w:t>State Management</w:t>
       </w:r>
     </w:p>
@@ -658,14 +458,8 @@
           <w:numId w:val="4"/>
         </w:numPr>
         <w:spacing w:line="240" w:lineRule="auto"/>
-        <w:rPr>
-          <w:lang w:val="en-PK"/>
-        </w:rPr>
-      </w:pPr>
-      <w:r>
-        <w:rPr>
-          <w:lang w:val="en-PK"/>
-        </w:rPr>
+      </w:pPr>
+      <w:r>
         <w:t>Understanding the useState hook</w:t>
       </w:r>
     </w:p>
@@ -676,14 +470,8 @@
           <w:numId w:val="4"/>
         </w:numPr>
         <w:spacing w:line="240" w:lineRule="auto"/>
-        <w:rPr>
-          <w:lang w:val="en-PK"/>
-        </w:rPr>
-      </w:pPr>
-      <w:r>
-        <w:rPr>
-          <w:lang w:val="en-PK"/>
-        </w:rPr>
+      </w:pPr>
+      <w:r>
         <w:t>Updating state in functional components</w:t>
       </w:r>
     </w:p>
@@ -694,14 +482,8 @@
           <w:numId w:val="4"/>
         </w:numPr>
         <w:spacing w:line="240" w:lineRule="auto"/>
-        <w:rPr>
-          <w:lang w:val="en-PK"/>
-        </w:rPr>
-      </w:pPr>
-      <w:r>
-        <w:rPr>
-          <w:lang w:val="en-PK"/>
-        </w:rPr>
+      </w:pPr>
+      <w:r>
         <w:t>Managing multiple states</w:t>
       </w:r>
     </w:p>
@@ -712,14 +494,8 @@
           <w:numId w:val="4"/>
         </w:numPr>
         <w:spacing w:line="240" w:lineRule="auto"/>
-        <w:rPr>
-          <w:lang w:val="en-PK"/>
-        </w:rPr>
-      </w:pPr>
-      <w:r>
-        <w:rPr>
-          <w:lang w:val="en-PK"/>
-        </w:rPr>
+      </w:pPr>
+      <w:r>
         <w:t>Five scenario-based practice examples</w:t>
       </w:r>
     </w:p>
@@ -730,14 +506,8 @@
           <w:numId w:val="4"/>
         </w:numPr>
         <w:spacing w:line="240" w:lineRule="auto"/>
-        <w:rPr>
-          <w:lang w:val="en-PK"/>
-        </w:rPr>
-      </w:pPr>
-      <w:r>
-        <w:rPr>
-          <w:lang w:val="en-PK"/>
-        </w:rPr>
+      </w:pPr>
+      <w:r>
         <w:t>Handling state changes properly</w:t>
       </w:r>
     </w:p>
@@ -747,14 +517,12 @@
         <w:rPr>
           <w:b/>
           <w:bCs/>
-          <w:lang w:val="en-PK"/>
         </w:rPr>
       </w:pPr>
       <w:r>
         <w:rPr>
           <w:b/>
           <w:bCs/>
-          <w:lang w:val="en-PK"/>
         </w:rPr>
         <w:t>Day 5: Form Creation in React</w:t>
       </w:r>
@@ -766,14 +534,8 @@
           <w:numId w:val="5"/>
         </w:numPr>
         <w:spacing w:line="240" w:lineRule="auto"/>
-        <w:rPr>
-          <w:lang w:val="en-PK"/>
-        </w:rPr>
-      </w:pPr>
-      <w:r>
-        <w:rPr>
-          <w:lang w:val="en-PK"/>
-        </w:rPr>
+      </w:pPr>
+      <w:r>
         <w:t>Creating a simple form</w:t>
       </w:r>
     </w:p>
@@ -784,14 +546,8 @@
           <w:numId w:val="5"/>
         </w:numPr>
         <w:spacing w:line="240" w:lineRule="auto"/>
-        <w:rPr>
-          <w:lang w:val="en-PK"/>
-        </w:rPr>
-      </w:pPr>
-      <w:r>
-        <w:rPr>
-          <w:lang w:val="en-PK"/>
-        </w:rPr>
+      </w:pPr>
+      <w:r>
         <w:t>Creating advanced forms</w:t>
       </w:r>
     </w:p>
@@ -802,14 +558,8 @@
           <w:numId w:val="5"/>
         </w:numPr>
         <w:spacing w:line="240" w:lineRule="auto"/>
-        <w:rPr>
-          <w:lang w:val="en-PK"/>
-        </w:rPr>
-      </w:pPr>
-      <w:r>
-        <w:rPr>
-          <w:lang w:val="en-PK"/>
-        </w:rPr>
+      </w:pPr>
+      <w:r>
         <w:t>Handling multiple input fields</w:t>
       </w:r>
     </w:p>
@@ -820,14 +570,8 @@
           <w:numId w:val="5"/>
         </w:numPr>
         <w:spacing w:line="240" w:lineRule="auto"/>
-        <w:rPr>
-          <w:lang w:val="en-PK"/>
-        </w:rPr>
-      </w:pPr>
-      <w:r>
-        <w:rPr>
-          <w:lang w:val="en-PK"/>
-        </w:rPr>
+      </w:pPr>
+      <w:r>
         <w:t>Text inputs</w:t>
       </w:r>
     </w:p>
@@ -838,14 +582,8 @@
           <w:numId w:val="5"/>
         </w:numPr>
         <w:spacing w:line="240" w:lineRule="auto"/>
-        <w:rPr>
-          <w:lang w:val="en-PK"/>
-        </w:rPr>
-      </w:pPr>
-      <w:r>
-        <w:rPr>
-          <w:lang w:val="en-PK"/>
-        </w:rPr>
+      </w:pPr>
+      <w:r>
         <w:t>Radio buttons</w:t>
       </w:r>
     </w:p>
@@ -856,14 +594,8 @@
           <w:numId w:val="5"/>
         </w:numPr>
         <w:spacing w:line="240" w:lineRule="auto"/>
-        <w:rPr>
-          <w:lang w:val="en-PK"/>
-        </w:rPr>
-      </w:pPr>
-      <w:r>
-        <w:rPr>
-          <w:lang w:val="en-PK"/>
-        </w:rPr>
+      </w:pPr>
+      <w:r>
         <w:t>Checkboxes</w:t>
       </w:r>
     </w:p>
@@ -874,14 +606,8 @@
           <w:numId w:val="5"/>
         </w:numPr>
         <w:spacing w:line="240" w:lineRule="auto"/>
-        <w:rPr>
-          <w:lang w:val="en-PK"/>
-        </w:rPr>
-      </w:pPr>
-      <w:r>
-        <w:rPr>
-          <w:lang w:val="en-PK"/>
-        </w:rPr>
+      </w:pPr>
+      <w:r>
         <w:t>Managing form state</w:t>
       </w:r>
     </w:p>
@@ -892,14 +618,8 @@
           <w:numId w:val="5"/>
         </w:numPr>
         <w:spacing w:line="240" w:lineRule="auto"/>
-        <w:rPr>
-          <w:lang w:val="en-PK"/>
-        </w:rPr>
-      </w:pPr>
-      <w:r>
-        <w:rPr>
-          <w:lang w:val="en-PK"/>
-        </w:rPr>
+      </w:pPr>
+      <w:r>
         <w:t>Handling form submission</w:t>
       </w:r>
     </w:p>
@@ -909,14 +629,12 @@
         <w:rPr>
           <w:b/>
           <w:bCs/>
-          <w:lang w:val="en-PK"/>
         </w:rPr>
       </w:pPr>
       <w:r>
         <w:rPr>
           <w:b/>
           <w:bCs/>
-          <w:lang w:val="en-PK"/>
         </w:rPr>
         <w:t>Day 6: useEffect in React</w:t>
       </w:r>
@@ -928,14 +646,8 @@
           <w:numId w:val="6"/>
         </w:numPr>
         <w:spacing w:line="240" w:lineRule="auto"/>
-        <w:rPr>
-          <w:lang w:val="en-PK"/>
-        </w:rPr>
-      </w:pPr>
-      <w:r>
-        <w:rPr>
-          <w:lang w:val="en-PK"/>
-        </w:rPr>
+      </w:pPr>
+      <w:r>
         <w:t>How to use useEffect</w:t>
       </w:r>
     </w:p>
@@ -946,14 +658,8 @@
           <w:numId w:val="6"/>
         </w:numPr>
         <w:spacing w:line="240" w:lineRule="auto"/>
-        <w:rPr>
-          <w:lang w:val="en-PK"/>
-        </w:rPr>
-      </w:pPr>
-      <w:r>
-        <w:rPr>
-          <w:lang w:val="en-PK"/>
-        </w:rPr>
+      </w:pPr>
+      <w:r>
         <w:t>Understanding dependency array</w:t>
       </w:r>
     </w:p>
@@ -964,14 +670,8 @@
           <w:numId w:val="6"/>
         </w:numPr>
         <w:spacing w:line="240" w:lineRule="auto"/>
-        <w:rPr>
-          <w:lang w:val="en-PK"/>
-        </w:rPr>
-      </w:pPr>
-      <w:r>
-        <w:rPr>
-          <w:lang w:val="en-PK"/>
-        </w:rPr>
+      </w:pPr>
+      <w:r>
         <w:t>Two real-life examples</w:t>
       </w:r>
     </w:p>
@@ -982,14 +682,8 @@
           <w:numId w:val="6"/>
         </w:numPr>
         <w:spacing w:line="240" w:lineRule="auto"/>
-        <w:rPr>
-          <w:lang w:val="en-PK"/>
-        </w:rPr>
-      </w:pPr>
-      <w:r>
-        <w:rPr>
-          <w:lang w:val="en-PK"/>
-        </w:rPr>
+      </w:pPr>
+      <w:r>
         <w:t>Fetching API data</w:t>
       </w:r>
     </w:p>
@@ -1000,14 +694,8 @@
           <w:numId w:val="6"/>
         </w:numPr>
         <w:spacing w:line="240" w:lineRule="auto"/>
-        <w:rPr>
-          <w:lang w:val="en-PK"/>
-        </w:rPr>
-      </w:pPr>
-      <w:r>
-        <w:rPr>
-          <w:lang w:val="en-PK"/>
-        </w:rPr>
+      </w:pPr>
+      <w:r>
         <w:t>Running side effects based on state changes</w:t>
       </w:r>
     </w:p>
@@ -1017,14 +705,12 @@
         <w:rPr>
           <w:b/>
           <w:bCs/>
-          <w:lang w:val="en-PK"/>
         </w:rPr>
       </w:pPr>
       <w:r>
         <w:rPr>
           <w:b/>
           <w:bCs/>
-          <w:lang w:val="en-PK"/>
         </w:rPr>
         <w:t xml:space="preserve">Day </w:t>
       </w:r>
@@ -1032,7 +718,6 @@
         <w:rPr>
           <w:b/>
           <w:bCs/>
-          <w:lang w:val="en-PK"/>
         </w:rPr>
         <w:t>7</w:t>
       </w:r>
@@ -1040,7 +725,6 @@
         <w:rPr>
           <w:b/>
           <w:bCs/>
-          <w:lang w:val="en-PK"/>
         </w:rPr>
         <w:t xml:space="preserve">: </w:t>
       </w:r>
@@ -1048,7 +732,6 @@
         <w:rPr>
           <w:b/>
           <w:bCs/>
-          <w:lang w:val="en-PK"/>
         </w:rPr>
         <w:t>Browser router</w:t>
       </w:r>
@@ -1060,20 +743,11 @@
           <w:numId w:val="6"/>
         </w:numPr>
         <w:spacing w:line="240" w:lineRule="auto"/>
-        <w:rPr>
-          <w:lang w:val="en-PK"/>
-        </w:rPr>
-      </w:pPr>
-      <w:r>
-        <w:rPr>
-          <w:lang w:val="en-PK"/>
-        </w:rPr>
+      </w:pPr>
+      <w:r>
         <w:t>How to</w:t>
       </w:r>
       <w:r>
-        <w:rPr>
-          <w:lang w:val="en-PK"/>
-        </w:rPr>
         <w:t xml:space="preserve"> use Browser Router, Routes, Route</w:t>
       </w:r>
     </w:p>
@@ -1084,14 +758,8 @@
           <w:numId w:val="6"/>
         </w:numPr>
         <w:spacing w:line="240" w:lineRule="auto"/>
-        <w:rPr>
-          <w:lang w:val="en-PK"/>
-        </w:rPr>
-      </w:pPr>
-      <w:r>
-        <w:rPr>
-          <w:lang w:val="en-PK"/>
-        </w:rPr>
+      </w:pPr>
+      <w:r>
         <w:t>Use of Link</w:t>
       </w:r>
     </w:p>
@@ -1102,14 +770,8 @@
           <w:numId w:val="6"/>
         </w:numPr>
         <w:spacing w:line="240" w:lineRule="auto"/>
-        <w:rPr>
-          <w:lang w:val="en-PK"/>
-        </w:rPr>
-      </w:pPr>
-      <w:r>
-        <w:rPr>
-          <w:lang w:val="en-PK"/>
-        </w:rPr>
+      </w:pPr>
+      <w:r>
         <w:t>use Navigation</w:t>
       </w:r>
     </w:p>
@@ -1120,14 +782,8 @@
           <w:numId w:val="6"/>
         </w:numPr>
         <w:spacing w:line="240" w:lineRule="auto"/>
-        <w:rPr>
-          <w:lang w:val="en-PK"/>
-        </w:rPr>
-      </w:pPr>
-      <w:r>
-        <w:rPr>
-          <w:lang w:val="en-PK"/>
-        </w:rPr>
+      </w:pPr>
+      <w:r>
         <w:t>UseParams</w:t>
       </w:r>
     </w:p>
@@ -1138,14 +794,8 @@
           <w:numId w:val="6"/>
         </w:numPr>
         <w:spacing w:line="240" w:lineRule="auto"/>
-        <w:rPr>
-          <w:lang w:val="en-PK"/>
-        </w:rPr>
-      </w:pPr>
-      <w:r>
-        <w:rPr>
-          <w:lang w:val="en-PK"/>
-        </w:rPr>
+      </w:pPr>
+      <w:r>
         <w:t>Outlet Use</w:t>
       </w:r>
     </w:p>
@@ -1156,17 +806,127 @@
           <w:numId w:val="6"/>
         </w:numPr>
         <w:spacing w:line="240" w:lineRule="auto"/>
-        <w:rPr>
-          <w:lang w:val="en-PK"/>
-        </w:rPr>
-      </w:pPr>
-      <w:r>
-        <w:rPr>
-          <w:lang w:val="en-PK"/>
-        </w:rPr>
+      </w:pPr>
+      <w:r>
         <w:lastRenderedPageBreak/>
         <w:t>Global Route * Page Not Found</w:t>
       </w:r>
+    </w:p>
+    <w:p>
+      <w:pPr>
+        <w:spacing w:line="240" w:lineRule="auto"/>
+        <w:ind w:left="360"/>
+      </w:pPr>
+    </w:p>
+    <w:p>
+      <w:pPr>
+        <w:spacing w:line="240" w:lineRule="auto"/>
+        <w:rPr>
+          <w:b/>
+          <w:bCs/>
+        </w:rPr>
+      </w:pPr>
+      <w:r>
+        <w:rPr>
+          <w:b/>
+          <w:bCs/>
+        </w:rPr>
+        <w:t xml:space="preserve">Day </w:t>
+      </w:r>
+      <w:r>
+        <w:rPr>
+          <w:b/>
+          <w:bCs/>
+        </w:rPr>
+        <w:t>8</w:t>
+      </w:r>
+      <w:r>
+        <w:rPr>
+          <w:b/>
+          <w:bCs/>
+        </w:rPr>
+        <w:t>: useEffect</w:t>
+      </w:r>
+      <w:r>
+        <w:rPr>
+          <w:b/>
+          <w:bCs/>
+        </w:rPr>
+        <w:t>Event</w:t>
+      </w:r>
+      <w:r>
+        <w:rPr>
+          <w:b/>
+          <w:bCs/>
+        </w:rPr>
+        <w:t xml:space="preserve"> in React</w:t>
+      </w:r>
+    </w:p>
+    <w:p>
+      <w:pPr>
+        <w:spacing w:line="240" w:lineRule="auto"/>
+        <w:rPr>
+          <w:b/>
+          <w:bCs/>
+        </w:rPr>
+      </w:pPr>
+      <w:r>
+        <w:rPr>
+          <w:b/>
+          <w:bCs/>
+        </w:rPr>
+        <w:t xml:space="preserve">Day </w:t>
+      </w:r>
+      <w:r>
+        <w:rPr>
+          <w:b/>
+          <w:bCs/>
+        </w:rPr>
+        <w:t>9</w:t>
+      </w:r>
+      <w:r>
+        <w:rPr>
+          <w:b/>
+          <w:bCs/>
+        </w:rPr>
+        <w:t xml:space="preserve">: </w:t>
+      </w:r>
+      <w:r>
+        <w:rPr>
+          <w:b/>
+          <w:bCs/>
+        </w:rPr>
+        <w:t>useReducer</w:t>
+      </w:r>
+      <w:r>
+        <w:rPr>
+          <w:b/>
+          <w:bCs/>
+        </w:rPr>
+        <w:t xml:space="preserve"> in React</w:t>
+      </w:r>
+      <w:r>
+        <w:rPr>
+          <w:b/>
+          <w:bCs/>
+        </w:rPr>
+        <w:t>, useMemo in react</w:t>
+      </w:r>
+    </w:p>
+    <w:p>
+      <w:pPr>
+        <w:spacing w:line="240" w:lineRule="auto"/>
+        <w:rPr>
+          <w:b/>
+          <w:bCs/>
+        </w:rPr>
+      </w:pPr>
+    </w:p>
+    <w:p>
+      <w:pPr>
+        <w:spacing w:line="240" w:lineRule="auto"/>
+        <w:ind w:left="360"/>
+      </w:pPr>
     </w:p>
     <w:sectPr>
       <w:pgSz w:w="11906" w:h="16838"/>
@@ -2698,6 +2458,7 @@
   <w:style w:type="character" w:default="1" w:styleId="DefaultParagraphFont">
     <w:name w:val="Default Paragraph Font"/>
     <w:uiPriority w:val="1"/>
+    <w:semiHidden/>
     <w:unhideWhenUsed/>
   </w:style>
   <w:style w:type="table" w:default="1" w:styleId="TableNormal">

</xml_diff>

<commit_message>
Day 10 Part 1: How to use useCallBack, purpose of useCallBack
</commit_message>
<xml_diff>
--- a/Learning React.docx
+++ b/Learning React.docx
@@ -911,6 +911,22 @@
           <w:bCs/>
         </w:rPr>
         <w:t>, useMemo in react</w:t>
+      </w:r>
+    </w:p>
+    <w:p>
+      <w:pPr>
+        <w:spacing w:line="240" w:lineRule="auto"/>
+        <w:rPr>
+          <w:b/>
+          <w:bCs/>
+        </w:rPr>
+      </w:pPr>
+      <w:r>
+        <w:rPr>
+          <w:b/>
+          <w:bCs/>
+        </w:rPr>
+        <w:t>Day 10 useCallback hook</w:t>
       </w:r>
     </w:p>
     <w:p>

</xml_diff>

<commit_message>
Day 11 Part 1: How to use custom Hooks in recat
</commit_message>
<xml_diff>
--- a/Learning React.docx
+++ b/Learning React.docx
@@ -927,6 +927,13 @@
           <w:bCs/>
         </w:rPr>
         <w:t>Day 10 useCallback hook</w:t>
+      </w:r>
+      <w:r>
+        <w:rPr>
+          <w:b/>
+          <w:bCs/>
+        </w:rPr>
+        <w:t>, useLayoutEffect</w:t>
       </w:r>
     </w:p>
     <w:p>

</xml_diff>

<commit_message>
Day 13 Part 1: Learn Error Boundaries
</commit_message>
<xml_diff>
--- a/Learning React.docx
+++ b/Learning React.docx
@@ -934,6 +934,52 @@
           <w:bCs/>
         </w:rPr>
         <w:t>, useLayoutEffect</w:t>
+      </w:r>
+      <w:r>
+        <w:rPr>
+          <w:b/>
+          <w:bCs/>
+        </w:rPr>
+        <w:t xml:space="preserve"> Hook</w:t>
+      </w:r>
+    </w:p>
+    <w:p>
+      <w:pPr>
+        <w:spacing w:line="240" w:lineRule="auto"/>
+        <w:rPr>
+          <w:b/>
+          <w:bCs/>
+        </w:rPr>
+      </w:pPr>
+      <w:r>
+        <w:rPr>
+          <w:b/>
+          <w:bCs/>
+        </w:rPr>
+        <w:t>Day 11 Custom Hooks</w:t>
+      </w:r>
+    </w:p>
+    <w:p>
+      <w:pPr>
+        <w:spacing w:line="240" w:lineRule="auto"/>
+        <w:rPr>
+          <w:b/>
+          <w:bCs/>
+        </w:rPr>
+      </w:pPr>
+      <w:r>
+        <w:rPr>
+          <w:b/>
+          <w:bCs/>
+        </w:rPr>
+        <w:t>Day 12 Lazy Loading</w:t>
+      </w:r>
+      <w:r>
+        <w:rPr>
+          <w:b/>
+          <w:bCs/>
+        </w:rPr>
+        <w:t xml:space="preserve"> Concept </w:t>
       </w:r>
     </w:p>
     <w:p>

</xml_diff>

<commit_message>
Day 13 Part 2: Learn simple Form creation using Form-Hook Libraray makig things easier, efficent and understadable
</commit_message>
<xml_diff>
--- a/Learning React.docx
+++ b/Learning React.docx
@@ -980,6 +980,22 @@
           <w:bCs/>
         </w:rPr>
         <w:t xml:space="preserve"> Concept </w:t>
+      </w:r>
+    </w:p>
+    <w:p>
+      <w:pPr>
+        <w:spacing w:line="240" w:lineRule="auto"/>
+        <w:rPr>
+          <w:b/>
+          <w:bCs/>
+        </w:rPr>
+      </w:pPr>
+      <w:r>
+        <w:rPr>
+          <w:b/>
+          <w:bCs/>
+        </w:rPr>
+        <w:t>Day 13 Error Boundaries</w:t>
       </w:r>
     </w:p>
     <w:p>

</xml_diff>

<commit_message>
Day 14: Learn how to add radio buttons, checkboxes, slelectboxes in react using React-Hook-Form 2ndly how to print data on in browser instead of console using json.stringify
</commit_message>
<xml_diff>
--- a/Learning React.docx
+++ b/Learning React.docx
@@ -995,7 +995,69 @@
           <w:b/>
           <w:bCs/>
         </w:rPr>
-        <w:t>Day 13 Error Boundaries</w:t>
+        <w:t>Day 13</w:t>
+      </w:r>
+      <w:r>
+        <w:rPr>
+          <w:b/>
+          <w:bCs/>
+        </w:rPr>
+        <w:t xml:space="preserve"> Part 1: </w:t>
+      </w:r>
+      <w:r>
+        <w:rPr>
+          <w:b/>
+          <w:bCs/>
+        </w:rPr>
+        <w:t xml:space="preserve"> Error </w:t>
+      </w:r>
+      <w:proofErr w:type="gramStart"/>
+      <w:r>
+        <w:rPr>
+          <w:b/>
+          <w:bCs/>
+        </w:rPr>
+        <w:t>Boundaries</w:t>
+      </w:r>
+      <w:r>
+        <w:rPr>
+          <w:b/>
+          <w:bCs/>
+        </w:rPr>
+        <w:t xml:space="preserve">  Part</w:t>
+      </w:r>
+      <w:proofErr w:type="gramEnd"/>
+      <w:r>
+        <w:rPr>
+          <w:b/>
+          <w:bCs/>
+        </w:rPr>
+        <w:t xml:space="preserve"> 2: Form creation in advance way using Form-Hook </w:t>
+      </w:r>
+      <w:proofErr w:type="spellStart"/>
+      <w:proofErr w:type="gramStart"/>
+      <w:r>
+        <w:rPr>
+          <w:b/>
+          <w:bCs/>
+        </w:rPr>
+        <w:t>libraray</w:t>
+      </w:r>
+      <w:proofErr w:type="spellEnd"/>
+      <w:r>
+        <w:rPr>
+          <w:b/>
+          <w:bCs/>
+        </w:rPr>
+        <w:t>(</w:t>
+      </w:r>
+      <w:proofErr w:type="gramEnd"/>
+      <w:r>
+        <w:rPr>
+          <w:b/>
+          <w:bCs/>
+        </w:rPr>
+        <w:t>Part I)</w:t>
       </w:r>
     </w:p>
     <w:p>

</xml_diff>

<commit_message>
Day 15 Part 2: We Learn Select-React Libraray and use of Select, CreateableSeclect and AsyncSelect
</commit_message>
<xml_diff>
--- a/Learning React.docx
+++ b/Learning React.docx
@@ -4,7 +4,7 @@
   <w:body>
     <w:p>
       <w:pPr>
-        <w:spacing w:line="240" w:lineRule="auto"/>
+        <w:spacing w:line="360" w:lineRule="auto"/>
         <w:rPr>
           <w:b/>
           <w:bCs/>
@@ -24,7 +24,7 @@
           <w:ilvl w:val="0"/>
           <w:numId w:val="1"/>
         </w:numPr>
-        <w:spacing w:line="240" w:lineRule="auto"/>
+        <w:spacing w:line="360" w:lineRule="auto"/>
       </w:pPr>
       <w:r>
         <w:t>What React is and how it works</w:t>
@@ -36,7 +36,7 @@
           <w:ilvl w:val="0"/>
           <w:numId w:val="1"/>
         </w:numPr>
-        <w:spacing w:line="240" w:lineRule="auto"/>
+        <w:spacing w:line="360" w:lineRule="auto"/>
       </w:pPr>
       <w:r>
         <w:t>Understanding JSX</w:t>
@@ -48,7 +48,7 @@
           <w:ilvl w:val="0"/>
           <w:numId w:val="1"/>
         </w:numPr>
-        <w:spacing w:line="240" w:lineRule="auto"/>
+        <w:spacing w:line="360" w:lineRule="auto"/>
       </w:pPr>
       <w:r>
         <w:t>Creating functional components</w:t>
@@ -60,7 +60,7 @@
           <w:ilvl w:val="0"/>
           <w:numId w:val="1"/>
         </w:numPr>
-        <w:spacing w:line="240" w:lineRule="auto"/>
+        <w:spacing w:line="360" w:lineRule="auto"/>
       </w:pPr>
       <w:r>
         <w:t>Merging multiple components into a main component</w:t>
@@ -72,7 +72,7 @@
           <w:ilvl w:val="0"/>
           <w:numId w:val="1"/>
         </w:numPr>
-        <w:spacing w:line="240" w:lineRule="auto"/>
+        <w:spacing w:line="360" w:lineRule="auto"/>
       </w:pPr>
       <w:r>
         <w:t>Understanding component structure</w:t>
@@ -84,7 +84,7 @@
           <w:ilvl w:val="0"/>
           <w:numId w:val="1"/>
         </w:numPr>
-        <w:spacing w:line="240" w:lineRule="auto"/>
+        <w:spacing w:line="360" w:lineRule="auto"/>
       </w:pPr>
       <w:r>
         <w:t>Learning component reusability</w:t>
@@ -92,7 +92,7 @@
     </w:p>
     <w:p>
       <w:pPr>
-        <w:spacing w:line="240" w:lineRule="auto"/>
+        <w:spacing w:line="360" w:lineRule="auto"/>
         <w:rPr>
           <w:b/>
           <w:bCs/>
@@ -112,7 +112,7 @@
           <w:ilvl w:val="0"/>
           <w:numId w:val="2"/>
         </w:numPr>
-        <w:spacing w:line="240" w:lineRule="auto"/>
+        <w:spacing w:line="360" w:lineRule="auto"/>
       </w:pPr>
       <w:r>
         <w:t>Styling in JSX</w:t>
@@ -124,7 +124,7 @@
           <w:ilvl w:val="1"/>
           <w:numId w:val="2"/>
         </w:numPr>
-        <w:spacing w:line="240" w:lineRule="auto"/>
+        <w:spacing w:line="360" w:lineRule="auto"/>
       </w:pPr>
       <w:r>
         <w:t>Inline styling</w:t>
@@ -136,7 +136,7 @@
           <w:ilvl w:val="1"/>
           <w:numId w:val="2"/>
         </w:numPr>
-        <w:spacing w:line="240" w:lineRule="auto"/>
+        <w:spacing w:line="360" w:lineRule="auto"/>
       </w:pPr>
       <w:r>
         <w:t>Internal styling</w:t>
@@ -148,7 +148,7 @@
           <w:ilvl w:val="1"/>
           <w:numId w:val="2"/>
         </w:numPr>
-        <w:spacing w:line="240" w:lineRule="auto"/>
+        <w:spacing w:line="360" w:lineRule="auto"/>
       </w:pPr>
       <w:r>
         <w:t>External CSS styling</w:t>
@@ -160,7 +160,7 @@
           <w:ilvl w:val="1"/>
           <w:numId w:val="2"/>
         </w:numPr>
-        <w:spacing w:line="240" w:lineRule="auto"/>
+        <w:spacing w:line="360" w:lineRule="auto"/>
       </w:pPr>
       <w:r>
         <w:t>Applying dynamic styles</w:t>
@@ -172,7 +172,7 @@
           <w:ilvl w:val="0"/>
           <w:numId w:val="2"/>
         </w:numPr>
-        <w:spacing w:line="240" w:lineRule="auto"/>
+        <w:spacing w:line="360" w:lineRule="auto"/>
       </w:pPr>
       <w:r>
         <w:t>Functions &amp; Events</w:t>
@@ -184,7 +184,7 @@
           <w:ilvl w:val="1"/>
           <w:numId w:val="2"/>
         </w:numPr>
-        <w:spacing w:line="240" w:lineRule="auto"/>
+        <w:spacing w:line="360" w:lineRule="auto"/>
       </w:pPr>
       <w:r>
         <w:t>Normal functions</w:t>
@@ -196,7 +196,7 @@
           <w:ilvl w:val="1"/>
           <w:numId w:val="2"/>
         </w:numPr>
-        <w:spacing w:line="240" w:lineRule="auto"/>
+        <w:spacing w:line="360" w:lineRule="auto"/>
       </w:pPr>
       <w:r>
         <w:t>Arrow functions</w:t>
@@ -208,7 +208,7 @@
           <w:ilvl w:val="1"/>
           <w:numId w:val="2"/>
         </w:numPr>
-        <w:spacing w:line="240" w:lineRule="auto"/>
+        <w:spacing w:line="360" w:lineRule="auto"/>
       </w:pPr>
       <w:r>
         <w:t>Nested functions</w:t>
@@ -220,7 +220,7 @@
           <w:ilvl w:val="1"/>
           <w:numId w:val="2"/>
         </w:numPr>
-        <w:spacing w:line="240" w:lineRule="auto"/>
+        <w:spacing w:line="360" w:lineRule="auto"/>
       </w:pPr>
       <w:r>
         <w:t>Handling events</w:t>
@@ -232,7 +232,7 @@
           <w:ilvl w:val="1"/>
           <w:numId w:val="2"/>
         </w:numPr>
-        <w:spacing w:line="240" w:lineRule="auto"/>
+        <w:spacing w:line="360" w:lineRule="auto"/>
       </w:pPr>
       <w:r>
         <w:t>Using multiple event handlers</w:t>
@@ -244,7 +244,7 @@
           <w:ilvl w:val="0"/>
           <w:numId w:val="2"/>
         </w:numPr>
-        <w:spacing w:line="240" w:lineRule="auto"/>
+        <w:spacing w:line="360" w:lineRule="auto"/>
       </w:pPr>
       <w:r>
         <w:t>Objects &amp; Classes</w:t>
@@ -256,7 +256,7 @@
           <w:ilvl w:val="1"/>
           <w:numId w:val="2"/>
         </w:numPr>
-        <w:spacing w:line="240" w:lineRule="auto"/>
+        <w:spacing w:line="360" w:lineRule="auto"/>
       </w:pPr>
       <w:r>
         <w:t>Creating and using objects</w:t>
@@ -268,7 +268,7 @@
           <w:ilvl w:val="1"/>
           <w:numId w:val="2"/>
         </w:numPr>
-        <w:spacing w:line="240" w:lineRule="auto"/>
+        <w:spacing w:line="360" w:lineRule="auto"/>
       </w:pPr>
       <w:r>
         <w:t>Basics of classes</w:t>
@@ -280,7 +280,7 @@
           <w:ilvl w:val="1"/>
           <w:numId w:val="2"/>
         </w:numPr>
-        <w:spacing w:line="240" w:lineRule="auto"/>
+        <w:spacing w:line="360" w:lineRule="auto"/>
       </w:pPr>
       <w:r>
         <w:t>Using objects and classes inside React components</w:t>
@@ -288,7 +288,7 @@
     </w:p>
     <w:p>
       <w:pPr>
-        <w:spacing w:line="240" w:lineRule="auto"/>
+        <w:spacing w:line="360" w:lineRule="auto"/>
         <w:rPr>
           <w:b/>
           <w:bCs/>
@@ -299,6 +299,7 @@
           <w:b/>
           <w:bCs/>
         </w:rPr>
+        <w:lastRenderedPageBreak/>
         <w:t>Day 3: Conditional Rendering in React</w:t>
       </w:r>
     </w:p>
@@ -308,7 +309,7 @@
           <w:ilvl w:val="0"/>
           <w:numId w:val="3"/>
         </w:numPr>
-        <w:spacing w:line="240" w:lineRule="auto"/>
+        <w:spacing w:line="360" w:lineRule="auto"/>
       </w:pPr>
       <w:r>
         <w:t>Using if/else statements</w:t>
@@ -320,7 +321,7 @@
           <w:ilvl w:val="0"/>
           <w:numId w:val="3"/>
         </w:numPr>
-        <w:spacing w:line="240" w:lineRule="auto"/>
+        <w:spacing w:line="360" w:lineRule="auto"/>
       </w:pPr>
       <w:r>
         <w:t>Using switch statements</w:t>
@@ -332,7 +333,7 @@
           <w:ilvl w:val="0"/>
           <w:numId w:val="3"/>
         </w:numPr>
-        <w:spacing w:line="240" w:lineRule="auto"/>
+        <w:spacing w:line="360" w:lineRule="auto"/>
       </w:pPr>
       <w:r>
         <w:t>Using ternary operators</w:t>
@@ -344,7 +345,7 @@
           <w:ilvl w:val="0"/>
           <w:numId w:val="3"/>
         </w:numPr>
-        <w:spacing w:line="240" w:lineRule="auto"/>
+        <w:spacing w:line="360" w:lineRule="auto"/>
       </w:pPr>
       <w:r>
         <w:t>Rendering different UI based on conditions</w:t>
@@ -356,7 +357,7 @@
           <w:ilvl w:val="0"/>
           <w:numId w:val="3"/>
         </w:numPr>
-        <w:spacing w:line="240" w:lineRule="auto"/>
+        <w:spacing w:line="360" w:lineRule="auto"/>
       </w:pPr>
       <w:r>
         <w:t>Practical conditional rendering examples</w:t>
@@ -364,7 +365,7 @@
     </w:p>
     <w:p>
       <w:pPr>
-        <w:spacing w:line="240" w:lineRule="auto"/>
+        <w:spacing w:line="360" w:lineRule="auto"/>
         <w:rPr>
           <w:b/>
           <w:bCs/>
@@ -384,7 +385,7 @@
           <w:ilvl w:val="0"/>
           <w:numId w:val="4"/>
         </w:numPr>
-        <w:spacing w:line="240" w:lineRule="auto"/>
+        <w:spacing w:line="360" w:lineRule="auto"/>
       </w:pPr>
       <w:r>
         <w:t>Props in React</w:t>
@@ -396,10 +397,9 @@
           <w:ilvl w:val="1"/>
           <w:numId w:val="4"/>
         </w:numPr>
-        <w:spacing w:line="240" w:lineRule="auto"/>
-      </w:pPr>
-      <w:r>
-        <w:lastRenderedPageBreak/>
+        <w:spacing w:line="360" w:lineRule="auto"/>
+      </w:pPr>
+      <w:r>
         <w:t>Three different ways to pass props</w:t>
       </w:r>
     </w:p>
@@ -409,7 +409,7 @@
           <w:ilvl w:val="1"/>
           <w:numId w:val="4"/>
         </w:numPr>
-        <w:spacing w:line="240" w:lineRule="auto"/>
+        <w:spacing w:line="360" w:lineRule="auto"/>
       </w:pPr>
       <w:r>
         <w:t>Setting default props values</w:t>
@@ -421,7 +421,7 @@
           <w:ilvl w:val="1"/>
           <w:numId w:val="4"/>
         </w:numPr>
-        <w:spacing w:line="240" w:lineRule="auto"/>
+        <w:spacing w:line="360" w:lineRule="auto"/>
       </w:pPr>
       <w:r>
         <w:t>Passing objects as props</w:t>
@@ -433,7 +433,7 @@
           <w:ilvl w:val="1"/>
           <w:numId w:val="4"/>
         </w:numPr>
-        <w:spacing w:line="240" w:lineRule="auto"/>
+        <w:spacing w:line="360" w:lineRule="auto"/>
       </w:pPr>
       <w:r>
         <w:t>Passing classes as props</w:t>
@@ -445,7 +445,7 @@
           <w:ilvl w:val="0"/>
           <w:numId w:val="4"/>
         </w:numPr>
-        <w:spacing w:line="240" w:lineRule="auto"/>
+        <w:spacing w:line="360" w:lineRule="auto"/>
       </w:pPr>
       <w:r>
         <w:t>State Management</w:t>
@@ -457,7 +457,7 @@
           <w:ilvl w:val="1"/>
           <w:numId w:val="4"/>
         </w:numPr>
-        <w:spacing w:line="240" w:lineRule="auto"/>
+        <w:spacing w:line="360" w:lineRule="auto"/>
       </w:pPr>
       <w:r>
         <w:t>Understanding the useState hook</w:t>
@@ -469,7 +469,7 @@
           <w:ilvl w:val="1"/>
           <w:numId w:val="4"/>
         </w:numPr>
-        <w:spacing w:line="240" w:lineRule="auto"/>
+        <w:spacing w:line="360" w:lineRule="auto"/>
       </w:pPr>
       <w:r>
         <w:t>Updating state in functional components</w:t>
@@ -481,7 +481,7 @@
           <w:ilvl w:val="1"/>
           <w:numId w:val="4"/>
         </w:numPr>
-        <w:spacing w:line="240" w:lineRule="auto"/>
+        <w:spacing w:line="360" w:lineRule="auto"/>
       </w:pPr>
       <w:r>
         <w:t>Managing multiple states</w:t>
@@ -493,7 +493,7 @@
           <w:ilvl w:val="1"/>
           <w:numId w:val="4"/>
         </w:numPr>
-        <w:spacing w:line="240" w:lineRule="auto"/>
+        <w:spacing w:line="360" w:lineRule="auto"/>
       </w:pPr>
       <w:r>
         <w:t>Five scenario-based practice examples</w:t>
@@ -505,7 +505,7 @@
           <w:ilvl w:val="1"/>
           <w:numId w:val="4"/>
         </w:numPr>
-        <w:spacing w:line="240" w:lineRule="auto"/>
+        <w:spacing w:line="360" w:lineRule="auto"/>
       </w:pPr>
       <w:r>
         <w:t>Handling state changes properly</w:t>
@@ -513,7 +513,7 @@
     </w:p>
     <w:p>
       <w:pPr>
-        <w:spacing w:line="240" w:lineRule="auto"/>
+        <w:spacing w:line="360" w:lineRule="auto"/>
         <w:rPr>
           <w:b/>
           <w:bCs/>
@@ -533,7 +533,7 @@
           <w:ilvl w:val="0"/>
           <w:numId w:val="5"/>
         </w:numPr>
-        <w:spacing w:line="240" w:lineRule="auto"/>
+        <w:spacing w:line="360" w:lineRule="auto"/>
       </w:pPr>
       <w:r>
         <w:t>Creating a simple form</w:t>
@@ -545,7 +545,7 @@
           <w:ilvl w:val="0"/>
           <w:numId w:val="5"/>
         </w:numPr>
-        <w:spacing w:line="240" w:lineRule="auto"/>
+        <w:spacing w:line="360" w:lineRule="auto"/>
       </w:pPr>
       <w:r>
         <w:t>Creating advanced forms</w:t>
@@ -557,7 +557,7 @@
           <w:ilvl w:val="0"/>
           <w:numId w:val="5"/>
         </w:numPr>
-        <w:spacing w:line="240" w:lineRule="auto"/>
+        <w:spacing w:line="360" w:lineRule="auto"/>
       </w:pPr>
       <w:r>
         <w:t>Handling multiple input fields</w:t>
@@ -569,7 +569,7 @@
           <w:ilvl w:val="1"/>
           <w:numId w:val="5"/>
         </w:numPr>
-        <w:spacing w:line="240" w:lineRule="auto"/>
+        <w:spacing w:line="360" w:lineRule="auto"/>
       </w:pPr>
       <w:r>
         <w:t>Text inputs</w:t>
@@ -581,9 +581,10 @@
           <w:ilvl w:val="1"/>
           <w:numId w:val="5"/>
         </w:numPr>
-        <w:spacing w:line="240" w:lineRule="auto"/>
-      </w:pPr>
-      <w:r>
+        <w:spacing w:line="360" w:lineRule="auto"/>
+      </w:pPr>
+      <w:r>
+        <w:lastRenderedPageBreak/>
         <w:t>Radio buttons</w:t>
       </w:r>
     </w:p>
@@ -593,7 +594,7 @@
           <w:ilvl w:val="1"/>
           <w:numId w:val="5"/>
         </w:numPr>
-        <w:spacing w:line="240" w:lineRule="auto"/>
+        <w:spacing w:line="360" w:lineRule="auto"/>
       </w:pPr>
       <w:r>
         <w:t>Checkboxes</w:t>
@@ -605,7 +606,7 @@
           <w:ilvl w:val="0"/>
           <w:numId w:val="5"/>
         </w:numPr>
-        <w:spacing w:line="240" w:lineRule="auto"/>
+        <w:spacing w:line="360" w:lineRule="auto"/>
       </w:pPr>
       <w:r>
         <w:t>Managing form state</w:t>
@@ -617,7 +618,7 @@
           <w:ilvl w:val="0"/>
           <w:numId w:val="5"/>
         </w:numPr>
-        <w:spacing w:line="240" w:lineRule="auto"/>
+        <w:spacing w:line="360" w:lineRule="auto"/>
       </w:pPr>
       <w:r>
         <w:t>Handling form submission</w:t>
@@ -625,7 +626,7 @@
     </w:p>
     <w:p>
       <w:pPr>
-        <w:spacing w:line="240" w:lineRule="auto"/>
+        <w:spacing w:line="360" w:lineRule="auto"/>
         <w:rPr>
           <w:b/>
           <w:bCs/>
@@ -645,7 +646,7 @@
           <w:ilvl w:val="0"/>
           <w:numId w:val="6"/>
         </w:numPr>
-        <w:spacing w:line="240" w:lineRule="auto"/>
+        <w:spacing w:line="360" w:lineRule="auto"/>
       </w:pPr>
       <w:r>
         <w:t>How to use useEffect</w:t>
@@ -657,7 +658,7 @@
           <w:ilvl w:val="0"/>
           <w:numId w:val="6"/>
         </w:numPr>
-        <w:spacing w:line="240" w:lineRule="auto"/>
+        <w:spacing w:line="360" w:lineRule="auto"/>
       </w:pPr>
       <w:r>
         <w:t>Understanding dependency array</w:t>
@@ -669,7 +670,7 @@
           <w:ilvl w:val="0"/>
           <w:numId w:val="6"/>
         </w:numPr>
-        <w:spacing w:line="240" w:lineRule="auto"/>
+        <w:spacing w:line="360" w:lineRule="auto"/>
       </w:pPr>
       <w:r>
         <w:t>Two real-life examples</w:t>
@@ -681,7 +682,7 @@
           <w:ilvl w:val="1"/>
           <w:numId w:val="6"/>
         </w:numPr>
-        <w:spacing w:line="240" w:lineRule="auto"/>
+        <w:spacing w:line="360" w:lineRule="auto"/>
       </w:pPr>
       <w:r>
         <w:t>Fetching API data</w:t>
@@ -693,7 +694,7 @@
           <w:ilvl w:val="1"/>
           <w:numId w:val="6"/>
         </w:numPr>
-        <w:spacing w:line="240" w:lineRule="auto"/>
+        <w:spacing w:line="360" w:lineRule="auto"/>
       </w:pPr>
       <w:r>
         <w:t>Running side effects based on state changes</w:t>
@@ -701,7 +702,7 @@
     </w:p>
     <w:p>
       <w:pPr>
-        <w:spacing w:line="240" w:lineRule="auto"/>
+        <w:spacing w:line="360" w:lineRule="auto"/>
         <w:rPr>
           <w:b/>
           <w:bCs/>
@@ -742,7 +743,7 @@
           <w:ilvl w:val="0"/>
           <w:numId w:val="6"/>
         </w:numPr>
-        <w:spacing w:line="240" w:lineRule="auto"/>
+        <w:spacing w:line="360" w:lineRule="auto"/>
       </w:pPr>
       <w:r>
         <w:t>How to</w:t>
@@ -757,7 +758,7 @@
           <w:ilvl w:val="0"/>
           <w:numId w:val="6"/>
         </w:numPr>
-        <w:spacing w:line="240" w:lineRule="auto"/>
+        <w:spacing w:line="360" w:lineRule="auto"/>
       </w:pPr>
       <w:r>
         <w:t>Use of Link</w:t>
@@ -769,7 +770,7 @@
           <w:ilvl w:val="0"/>
           <w:numId w:val="6"/>
         </w:numPr>
-        <w:spacing w:line="240" w:lineRule="auto"/>
+        <w:spacing w:line="360" w:lineRule="auto"/>
       </w:pPr>
       <w:r>
         <w:t>use Navigation</w:t>
@@ -781,7 +782,7 @@
           <w:ilvl w:val="0"/>
           <w:numId w:val="6"/>
         </w:numPr>
-        <w:spacing w:line="240" w:lineRule="auto"/>
+        <w:spacing w:line="360" w:lineRule="auto"/>
       </w:pPr>
       <w:r>
         <w:t>UseParams</w:t>
@@ -793,7 +794,7 @@
           <w:ilvl w:val="0"/>
           <w:numId w:val="6"/>
         </w:numPr>
-        <w:spacing w:line="240" w:lineRule="auto"/>
+        <w:spacing w:line="360" w:lineRule="auto"/>
       </w:pPr>
       <w:r>
         <w:t>Outlet Use</w:t>
@@ -805,22 +806,15 @@
           <w:ilvl w:val="0"/>
           <w:numId w:val="6"/>
         </w:numPr>
-        <w:spacing w:line="240" w:lineRule="auto"/>
-      </w:pPr>
-      <w:r>
-        <w:lastRenderedPageBreak/>
+        <w:spacing w:line="360" w:lineRule="auto"/>
+      </w:pPr>
+      <w:r>
         <w:t>Global Route * Page Not Found</w:t>
       </w:r>
     </w:p>
     <w:p>
       <w:pPr>
-        <w:spacing w:line="240" w:lineRule="auto"/>
-        <w:ind w:left="360"/>
-      </w:pPr>
-    </w:p>
-    <w:p>
-      <w:pPr>
-        <w:spacing w:line="240" w:lineRule="auto"/>
+        <w:spacing w:line="360" w:lineRule="auto"/>
         <w:rPr>
           <w:b/>
           <w:bCs/>
@@ -831,40 +825,113 @@
           <w:b/>
           <w:bCs/>
         </w:rPr>
-        <w:t xml:space="preserve">Day </w:t>
-      </w:r>
-      <w:r>
+        <w:t>Day 8: useEffectEvent in React</w:t>
+      </w:r>
+    </w:p>
+    <w:p>
+      <w:pPr>
+        <w:spacing w:line="360" w:lineRule="auto"/>
+      </w:pPr>
+      <w:r>
+        <w:t>• Understanding the useEffectEvent hook</w:t>
+      </w:r>
+      <w:r>
+        <w:br/>
+        <w:t>• How it improves event handling inside effects</w:t>
+      </w:r>
+      <w:r>
+        <w:br/>
+        <w:t>• Practical examples of use cases</w:t>
+      </w:r>
+    </w:p>
+    <w:p>
+      <w:pPr>
+        <w:spacing w:line="360" w:lineRule="auto"/>
         <w:rPr>
           <w:b/>
           <w:bCs/>
         </w:rPr>
-        <w:t>8</w:t>
-      </w:r>
+      </w:pPr>
       <w:r>
         <w:rPr>
           <w:b/>
           <w:bCs/>
         </w:rPr>
-        <w:t>: useEffect</w:t>
-      </w:r>
+        <w:t>Day 9: Advanced Hooks (Part 1 &amp; Part 2)</w:t>
+      </w:r>
+    </w:p>
+    <w:p>
+      <w:pPr>
+        <w:pStyle w:val="ListParagraph"/>
+        <w:numPr>
+          <w:ilvl w:val="0"/>
+          <w:numId w:val="8"/>
+        </w:numPr>
+        <w:spacing w:line="360" w:lineRule="auto"/>
+      </w:pPr>
       <w:r>
         <w:rPr>
           <w:b/>
           <w:bCs/>
         </w:rPr>
-        <w:t>Event</w:t>
-      </w:r>
+        <w:t>useReducer in React</w:t>
+      </w:r>
+      <w:r>
+        <w:br/>
+        <w:t>• Understanding the useReducer hook</w:t>
+      </w:r>
+      <w:r>
+        <w:br/>
+      </w:r>
+      <w:r>
+        <w:lastRenderedPageBreak/>
+        <w:t>• Difference between useState and useReducer</w:t>
+      </w:r>
+      <w:r>
+        <w:br/>
+        <w:t>• Managing complex state logic</w:t>
+      </w:r>
+      <w:r>
+        <w:br/>
+        <w:t>• Practical examples</w:t>
+      </w:r>
+    </w:p>
+    <w:p>
+      <w:pPr>
+        <w:pStyle w:val="ListParagraph"/>
+        <w:numPr>
+          <w:ilvl w:val="0"/>
+          <w:numId w:val="8"/>
+        </w:numPr>
+        <w:spacing w:line="360" w:lineRule="auto"/>
+      </w:pPr>
       <w:r>
         <w:rPr>
           <w:b/>
           <w:bCs/>
         </w:rPr>
-        <w:t xml:space="preserve"> in React</w:t>
-      </w:r>
-    </w:p>
-    <w:p>
-      <w:pPr>
-        <w:spacing w:line="240" w:lineRule="auto"/>
+        <w:t>useMemo in React</w:t>
+      </w:r>
+      <w:r>
+        <w:br/>
+        <w:t>• Understanding the useMemo hook</w:t>
+      </w:r>
+      <w:r>
+        <w:br/>
+        <w:t>• Optimizing performance</w:t>
+      </w:r>
+      <w:r>
+        <w:br/>
+        <w:t>• Preventing unnecessary re-renders</w:t>
+      </w:r>
+      <w:r>
+        <w:br/>
+        <w:t>• Real-world examples</w:t>
+      </w:r>
+    </w:p>
+    <w:p>
+      <w:pPr>
+        <w:spacing w:line="360" w:lineRule="auto"/>
         <w:rPr>
           <w:b/>
           <w:bCs/>
@@ -875,203 +942,482 @@
           <w:b/>
           <w:bCs/>
         </w:rPr>
-        <w:t xml:space="preserve">Day </w:t>
-      </w:r>
+        <w:t>Day 10: Performance &amp; Lifecycle Hooks</w:t>
+      </w:r>
+    </w:p>
+    <w:p>
+      <w:pPr>
+        <w:pStyle w:val="ListParagraph"/>
+        <w:numPr>
+          <w:ilvl w:val="0"/>
+          <w:numId w:val="9"/>
+        </w:numPr>
+        <w:spacing w:line="360" w:lineRule="auto"/>
+      </w:pPr>
       <w:r>
         <w:rPr>
           <w:b/>
           <w:bCs/>
         </w:rPr>
-        <w:t>9</w:t>
-      </w:r>
+        <w:t>useCallback Hook</w:t>
+      </w:r>
+      <w:r>
+        <w:br/>
+        <w:t>• Understanding the useCallback hook</w:t>
+      </w:r>
+      <w:r>
+        <w:br/>
+        <w:t>• Preventing unnecessary function re-creation</w:t>
+      </w:r>
+      <w:r>
+        <w:br/>
+        <w:t>• Optimizing child component rendering</w:t>
+      </w:r>
+    </w:p>
+    <w:p>
+      <w:pPr>
+        <w:pStyle w:val="ListParagraph"/>
+        <w:numPr>
+          <w:ilvl w:val="0"/>
+          <w:numId w:val="9"/>
+        </w:numPr>
+        <w:spacing w:line="360" w:lineRule="auto"/>
+      </w:pPr>
       <w:r>
         <w:rPr>
           <w:b/>
           <w:bCs/>
         </w:rPr>
-        <w:t xml:space="preserve">: </w:t>
-      </w:r>
-      <w:r>
+        <w:t>useLayoutEffect Hook</w:t>
+      </w:r>
+      <w:r>
+        <w:br/>
+        <w:t>• Understanding useLayoutEffect</w:t>
+      </w:r>
+      <w:r>
+        <w:br/>
+        <w:t>• Difference between useEffect and useLayoutEffect</w:t>
+      </w:r>
+      <w:r>
+        <w:br/>
+        <w:t>• When to use useLayoutEffect</w:t>
+      </w:r>
+    </w:p>
+    <w:p>
+      <w:pPr>
+        <w:spacing w:line="360" w:lineRule="auto"/>
         <w:rPr>
           <w:b/>
           <w:bCs/>
         </w:rPr>
-        <w:t>useReducer</w:t>
-      </w:r>
+      </w:pPr>
       <w:r>
         <w:rPr>
           <w:b/>
           <w:bCs/>
         </w:rPr>
-        <w:t xml:space="preserve"> in React</w:t>
-      </w:r>
-      <w:r>
+        <w:t>Day 11: Custom Hooks</w:t>
+      </w:r>
+    </w:p>
+    <w:p>
+      <w:pPr>
+        <w:spacing w:line="360" w:lineRule="auto"/>
+        <w:ind w:left="720"/>
+      </w:pPr>
+      <w:r>
+        <w:t>• What custom hooks are</w:t>
+      </w:r>
+      <w:r>
+        <w:br/>
+        <w:t>• Creating your own custom hook</w:t>
+      </w:r>
+      <w:r>
+        <w:br/>
+        <w:t>• Reusing logic across components</w:t>
+      </w:r>
+      <w:r>
+        <w:br/>
+        <w:t>• Real-world examples</w:t>
+      </w:r>
+    </w:p>
+    <w:p>
+      <w:pPr>
+        <w:spacing w:line="360" w:lineRule="auto"/>
         <w:rPr>
           <w:b/>
           <w:bCs/>
         </w:rPr>
-        <w:t>, useMemo in react</w:t>
-      </w:r>
-    </w:p>
-    <w:p>
-      <w:pPr>
-        <w:spacing w:line="240" w:lineRule="auto"/>
+      </w:pPr>
+      <w:r>
         <w:rPr>
           <w:b/>
           <w:bCs/>
         </w:rPr>
-      </w:pPr>
-      <w:r>
+        <w:t>Day 12: Lazy Loading Concept</w:t>
+      </w:r>
+    </w:p>
+    <w:p>
+      <w:pPr>
+        <w:spacing w:line="360" w:lineRule="auto"/>
+        <w:ind w:left="720"/>
+      </w:pPr>
+      <w:r>
+        <w:t>• What lazy loading is</w:t>
+      </w:r>
+      <w:r>
+        <w:br/>
+        <w:t>• Using React.lazy()</w:t>
+      </w:r>
+      <w:r>
+        <w:br/>
+        <w:t>• Using Suspense</w:t>
+      </w:r>
+      <w:r>
+        <w:br/>
+        <w:t>• Improving application performance</w:t>
+      </w:r>
+    </w:p>
+    <w:p>
+      <w:pPr>
+        <w:spacing w:line="360" w:lineRule="auto"/>
         <w:rPr>
           <w:b/>
           <w:bCs/>
         </w:rPr>
-        <w:t>Day 10 useCallback hook</w:t>
-      </w:r>
+      </w:pPr>
       <w:r>
         <w:rPr>
           <w:b/>
           <w:bCs/>
         </w:rPr>
-        <w:t>, useLayoutEffect</w:t>
-      </w:r>
+        <w:t>Day 13: Advanced Concepts (Part 1 &amp; Part 2)</w:t>
+      </w:r>
+    </w:p>
+    <w:p>
+      <w:pPr>
+        <w:pStyle w:val="ListParagraph"/>
+        <w:numPr>
+          <w:ilvl w:val="0"/>
+          <w:numId w:val="10"/>
+        </w:numPr>
+        <w:spacing w:line="360" w:lineRule="auto"/>
+      </w:pPr>
       <w:r>
         <w:rPr>
           <w:b/>
           <w:bCs/>
         </w:rPr>
-        <w:t xml:space="preserve"> Hook</w:t>
-      </w:r>
-    </w:p>
-    <w:p>
-      <w:pPr>
-        <w:spacing w:line="240" w:lineRule="auto"/>
+        <w:lastRenderedPageBreak/>
+        <w:t>Part 1: Error Boundaries</w:t>
+      </w:r>
+      <w:r>
+        <w:br/>
+        <w:t>• What error boundaries are</w:t>
+      </w:r>
+      <w:r>
+        <w:br/>
+        <w:t>• Why they are important</w:t>
+      </w:r>
+      <w:r>
+        <w:br/>
+        <w:t>• Creating an error boundary component</w:t>
+      </w:r>
+      <w:r>
+        <w:br/>
+        <w:t>• Handling runtime errors gracefully</w:t>
+      </w:r>
+    </w:p>
+    <w:p>
+      <w:pPr>
+        <w:pStyle w:val="ListParagraph"/>
+        <w:numPr>
+          <w:ilvl w:val="0"/>
+          <w:numId w:val="10"/>
+        </w:numPr>
+        <w:spacing w:line="360" w:lineRule="auto"/>
+      </w:pPr>
+      <w:r>
         <w:rPr>
           <w:b/>
           <w:bCs/>
         </w:rPr>
-      </w:pPr>
-      <w:r>
+        <w:t>Advanced Form Creation using React Hook Form (Part I)</w:t>
+      </w:r>
+      <w:r>
+        <w:br/>
+        <w:t>• Introduction to React Hook Form</w:t>
+      </w:r>
+      <w:r>
+        <w:br/>
+        <w:t>• Setting up the library</w:t>
+      </w:r>
+      <w:r>
+        <w:br/>
+        <w:t>• Creating controlled and uncontrolled forms</w:t>
+      </w:r>
+      <w:r>
+        <w:br/>
+        <w:t>• Handling validation basics</w:t>
+      </w:r>
+    </w:p>
+    <w:p>
+      <w:pPr>
+        <w:spacing w:line="360" w:lineRule="auto"/>
         <w:rPr>
           <w:b/>
           <w:bCs/>
         </w:rPr>
-        <w:t>Day 11 Custom Hooks</w:t>
-      </w:r>
-    </w:p>
-    <w:p>
-      <w:pPr>
-        <w:spacing w:line="240" w:lineRule="auto"/>
+      </w:pPr>
+      <w:r>
         <w:rPr>
           <w:b/>
           <w:bCs/>
         </w:rPr>
-      </w:pPr>
-      <w:r>
+        <w:t>Day 14: Advanced Form Fields</w:t>
+      </w:r>
+    </w:p>
+    <w:p>
+      <w:pPr>
+        <w:spacing w:line="360" w:lineRule="auto"/>
+      </w:pPr>
+      <w:r>
+        <w:t>• Working with advanced input types:</w:t>
+      </w:r>
+    </w:p>
+    <w:p>
+      <w:pPr>
+        <w:pStyle w:val="ListParagraph"/>
+        <w:numPr>
+          <w:ilvl w:val="0"/>
+          <w:numId w:val="11"/>
+        </w:numPr>
+        <w:spacing w:line="360" w:lineRule="auto"/>
+      </w:pPr>
+      <w:r>
+        <w:t>Checkbox</w:t>
+      </w:r>
+    </w:p>
+    <w:p>
+      <w:pPr>
+        <w:pStyle w:val="ListParagraph"/>
+        <w:numPr>
+          <w:ilvl w:val="0"/>
+          <w:numId w:val="11"/>
+        </w:numPr>
+        <w:spacing w:line="360" w:lineRule="auto"/>
+      </w:pPr>
+      <w:r>
+        <w:t>Date picker</w:t>
+      </w:r>
+    </w:p>
+    <w:p>
+      <w:pPr>
+        <w:pStyle w:val="ListParagraph"/>
+        <w:numPr>
+          <w:ilvl w:val="0"/>
+          <w:numId w:val="11"/>
+        </w:numPr>
+        <w:spacing w:line="360" w:lineRule="auto"/>
+      </w:pPr>
+      <w:r>
+        <w:t>Radio buttons</w:t>
+      </w:r>
+    </w:p>
+    <w:p>
+      <w:pPr>
+        <w:pStyle w:val="ListParagraph"/>
+        <w:numPr>
+          <w:ilvl w:val="0"/>
+          <w:numId w:val="11"/>
+        </w:numPr>
+        <w:spacing w:line="360" w:lineRule="auto"/>
+      </w:pPr>
+      <w:r>
+        <w:t>Select dropdown</w:t>
+      </w:r>
+      <w:r>
+        <w:br/>
+        <w:t>• Managing complex form state</w:t>
+      </w:r>
+      <w:r>
+        <w:br/>
+        <w:t>• Best practices for form structure</w:t>
+      </w:r>
+    </w:p>
+    <w:p>
+      <w:pPr>
+        <w:spacing w:line="360" w:lineRule="auto"/>
         <w:rPr>
           <w:b/>
           <w:bCs/>
         </w:rPr>
-        <w:t>Day 12 Lazy Loading</w:t>
-      </w:r>
+      </w:pPr>
       <w:r>
         <w:rPr>
           <w:b/>
           <w:bCs/>
         </w:rPr>
-        <w:t xml:space="preserve"> Concept </w:t>
-      </w:r>
-    </w:p>
-    <w:p>
-      <w:pPr>
-        <w:spacing w:line="240" w:lineRule="auto"/>
+        <w:t>Day 15: Form Enhancement &amp; Styling</w:t>
+      </w:r>
+    </w:p>
+    <w:p>
+      <w:pPr>
+        <w:pStyle w:val="ListParagraph"/>
+        <w:numPr>
+          <w:ilvl w:val="0"/>
+          <w:numId w:val="12"/>
+        </w:numPr>
+        <w:spacing w:line="360" w:lineRule="auto"/>
+      </w:pPr>
+      <w:r>
         <w:rPr>
           <w:b/>
           <w:bCs/>
         </w:rPr>
+        <w:t>Reset &amp; Submission Methods</w:t>
+      </w:r>
+      <w:r>
+        <w:br/>
+        <w:t>• Using reset() method</w:t>
+      </w:r>
+      <w:r>
+        <w:br/>
+        <w:t>• Understanding isSubmitted</w:t>
+      </w:r>
+      <w:r>
+        <w:br/>
+        <w:t>• Handling successful form submission</w:t>
+      </w:r>
+    </w:p>
+    <w:p>
+      <w:pPr>
+        <w:pStyle w:val="ListParagraph"/>
+        <w:numPr>
+          <w:ilvl w:val="0"/>
+          <w:numId w:val="12"/>
+        </w:numPr>
+        <w:spacing w:line="360" w:lineRule="auto"/>
       </w:pPr>
       <w:r>
         <w:rPr>
           <w:b/>
           <w:bCs/>
         </w:rPr>
-        <w:t>Day 13</w:t>
-      </w:r>
+        <w:t>Yup Form Validation Library</w:t>
+      </w:r>
+      <w:r>
+        <w:br/>
+        <w:t>• Introduction to Yup</w:t>
+      </w:r>
+      <w:r>
+        <w:br/>
+        <w:t>• Schema-based validation</w:t>
+      </w:r>
+      <w:r>
+        <w:br/>
+        <w:t>• Integrating Yup with React Hook Form</w:t>
+      </w:r>
+    </w:p>
+    <w:p>
+      <w:pPr>
+        <w:pStyle w:val="ListParagraph"/>
+        <w:numPr>
+          <w:ilvl w:val="0"/>
+          <w:numId w:val="12"/>
+        </w:numPr>
+        <w:spacing w:line="360" w:lineRule="auto"/>
+      </w:pPr>
       <w:r>
         <w:rPr>
           <w:b/>
           <w:bCs/>
         </w:rPr>
-        <w:t xml:space="preserve"> Part 1: </w:t>
-      </w:r>
+        <w:t>Tailwind CSS &amp; Prettier</w:t>
+      </w:r>
+      <w:r>
+        <w:br/>
+        <w:t>• Styling forms using Tailwind CSS</w:t>
+      </w:r>
+      <w:r>
+        <w:br/>
+      </w:r>
+      <w:r>
+        <w:lastRenderedPageBreak/>
+        <w:t>• Setting up Prettier</w:t>
+      </w:r>
+      <w:r>
+        <w:br/>
+        <w:t>• Writing clean and consistent code</w:t>
+      </w:r>
+    </w:p>
+    <w:p>
+      <w:pPr>
+        <w:pStyle w:val="ListParagraph"/>
+        <w:numPr>
+          <w:ilvl w:val="0"/>
+          <w:numId w:val="12"/>
+        </w:numPr>
+        <w:spacing w:line="360" w:lineRule="auto"/>
+      </w:pPr>
       <w:r>
         <w:rPr>
           <w:b/>
           <w:bCs/>
         </w:rPr>
-        <w:t xml:space="preserve"> Error </w:t>
-      </w:r>
-      <w:proofErr w:type="gramStart"/>
-      <w:r>
-        <w:rPr>
-          <w:b/>
-          <w:bCs/>
-        </w:rPr>
-        <w:t>Boundaries</w:t>
-      </w:r>
-      <w:r>
-        <w:rPr>
-          <w:b/>
-          <w:bCs/>
-        </w:rPr>
-        <w:t xml:space="preserve">  Part</w:t>
-      </w:r>
-      <w:proofErr w:type="gramEnd"/>
-      <w:r>
-        <w:rPr>
-          <w:b/>
-          <w:bCs/>
-        </w:rPr>
-        <w:t xml:space="preserve"> 2: Form creation in advance way using Form-Hook </w:t>
-      </w:r>
-      <w:proofErr w:type="spellStart"/>
-      <w:proofErr w:type="gramStart"/>
-      <w:r>
-        <w:rPr>
-          <w:b/>
-          <w:bCs/>
-        </w:rPr>
-        <w:t>libraray</w:t>
-      </w:r>
-      <w:proofErr w:type="spellEnd"/>
-      <w:r>
-        <w:rPr>
-          <w:b/>
-          <w:bCs/>
-        </w:rPr>
-        <w:t>(</w:t>
-      </w:r>
-      <w:proofErr w:type="gramEnd"/>
-      <w:r>
-        <w:rPr>
-          <w:b/>
-          <w:bCs/>
-        </w:rPr>
-        <w:t>Part I)</w:t>
-      </w:r>
-    </w:p>
-    <w:p>
-      <w:pPr>
-        <w:spacing w:line="240" w:lineRule="auto"/>
-        <w:rPr>
-          <w:b/>
-          <w:bCs/>
-        </w:rPr>
-      </w:pPr>
-    </w:p>
-    <w:p>
-      <w:pPr>
-        <w:spacing w:line="240" w:lineRule="auto"/>
+        <w:t>Select React</w:t>
+      </w:r>
+    </w:p>
+    <w:p>
+      <w:pPr>
+        <w:pStyle w:val="ListParagraph"/>
+        <w:spacing w:line="360" w:lineRule="auto"/>
+      </w:pPr>
+      <w:r>
+        <w:t xml:space="preserve">• </w:t>
+      </w:r>
+      <w:r>
+        <w:t>Select</w:t>
+      </w:r>
+      <w:r>
+        <w:br/>
+        <w:t xml:space="preserve">• </w:t>
+      </w:r>
+      <w:r>
+        <w:t>CreateableSelect</w:t>
+      </w:r>
+    </w:p>
+    <w:p>
+      <w:pPr>
+        <w:pStyle w:val="ListParagraph"/>
+        <w:spacing w:line="360" w:lineRule="auto"/>
+      </w:pPr>
+      <w:r>
+        <w:t xml:space="preserve">• </w:t>
+      </w:r>
+      <w:r>
+        <w:t>AsyncSelect</w:t>
+      </w:r>
+    </w:p>
+    <w:p>
+      <w:pPr>
+        <w:pStyle w:val="ListParagraph"/>
+        <w:spacing w:line="360" w:lineRule="auto"/>
+      </w:pPr>
+    </w:p>
+    <w:p>
+      <w:pPr>
+        <w:spacing w:line="360" w:lineRule="auto"/>
+        <w:ind w:left="360"/>
+      </w:pPr>
+    </w:p>
+    <w:p>
+      <w:pPr>
+        <w:spacing w:line="360" w:lineRule="auto"/>
+      </w:pPr>
+    </w:p>
+    <w:p>
+      <w:pPr>
+        <w:spacing w:line="360" w:lineRule="auto"/>
         <w:ind w:left="360"/>
       </w:pPr>
     </w:p>
@@ -1088,6 +1434,119 @@
 <file path=word/numbering.xml><?xml version="1.0" encoding="utf-8"?>
 <w:numbering xmlns:wpc="http://schemas.microsoft.com/office/word/2010/wordprocessingCanvas" xmlns:cx="http://schemas.microsoft.com/office/drawing/2014/chartex" xmlns:cx1="http://schemas.microsoft.com/office/drawing/2015/9/8/chartex" xmlns:cx2="http://schemas.microsoft.com/office/drawing/2015/10/21/chartex" xmlns:cx3="http://schemas.microsoft.com/office/drawing/2016/5/9/chartex" xmlns:cx4="http://schemas.microsoft.com/office/drawing/2016/5/10/chartex" xmlns:cx5="http://schemas.microsoft.com/office/drawing/2016/5/11/chartex" xmlns:cx6="http://schemas.microsoft.com/office/drawing/2016/5/12/chartex" xmlns:cx7="http://schemas.microsoft.com/office/drawing/2016/5/13/chartex" xmlns:cx8="http://schemas.microsoft.com/office/drawing/2016/5/14/chartex" xmlns:mc="http://schemas.openxmlformats.org/markup-compatibility/2006" xmlns:aink="http://schemas.microsoft.com/office/drawing/2016/ink" xmlns:am3d="http://schemas.microsoft.com/office/drawing/2017/model3d" xmlns:o="urn:schemas-microsoft-com:office:office" xmlns:oel="http://schemas.microsoft.com/office/2019/extlst" xmlns:r="http://schemas.openxmlformats.org/officeDocument/2006/relationships" xmlns:m="http://schemas.openxmlformats.org/officeDocument/2006/math" xmlns:v="urn:schemas-microsoft-com:vml" xmlns:wp14="http://schemas.microsoft.com/office/word/2010/wordprocessingDrawing" xmlns:wp="http://schemas.openxmlformats.org/drawingml/2006/wordprocessingDrawing" xmlns:w10="urn:schemas-microsoft-com:office:word" xmlns:w="http://schemas.openxmlformats.org/wordprocessingml/2006/main" xmlns:w14="http://schemas.microsoft.com/office/word/2010/wordml" xmlns:w15="http://schemas.microsoft.com/office/word/2012/wordml" xmlns:w16cex="http://schemas.microsoft.com/office/word/2018/wordml/cex" xmlns:w16cid="http://schemas.microsoft.com/office/word/2016/wordml/cid" xmlns:w16="http://schemas.microsoft.com/office/word/2018/wordml" xmlns:w16du="http://schemas.microsoft.com/office/word/2023/wordml/word16du" xmlns:w16sdtdh="http://schemas.microsoft.com/office/word/2020/wordml/sdtdatahash" xmlns:w16sdtfl="http://schemas.microsoft.com/office/word/2024/wordml/sdtformatlock" xmlns:w16se="http://schemas.microsoft.com/office/word/2015/wordml/symex" xmlns:wpg="http://schemas.microsoft.com/office/word/2010/wordprocessingGroup" xmlns:wpi="http://schemas.microsoft.com/office/word/2010/wordprocessingInk" xmlns:wne="http://schemas.microsoft.com/office/word/2006/wordml" xmlns:wps="http://schemas.microsoft.com/office/word/2010/wordprocessingShape" mc:Ignorable="w14 w15 w16se w16cid w16 w16cex w16sdtdh w16sdtfl w16du wp14">
   <w:abstractNum w:abstractNumId="0" w15:restartNumberingAfterBreak="0">
+    <w:nsid w:val="03976BC0"/>
+    <w:multiLevelType w:val="hybridMultilevel"/>
+    <w:tmpl w:val="017A00B6"/>
+    <w:lvl w:ilvl="0" w:tplc="20000001">
+      <w:start w:val="1"/>
+      <w:numFmt w:val="bullet"/>
+      <w:lvlText w:val=""/>
+      <w:lvlJc w:val="left"/>
+      <w:pPr>
+        <w:ind w:left="720" w:hanging="360"/>
+      </w:pPr>
+      <w:rPr>
+        <w:rFonts w:ascii="Symbol" w:hAnsi="Symbol" w:hint="default"/>
+      </w:rPr>
+    </w:lvl>
+    <w:lvl w:ilvl="1" w:tplc="20000003" w:tentative="1">
+      <w:start w:val="1"/>
+      <w:numFmt w:val="bullet"/>
+      <w:lvlText w:val="o"/>
+      <w:lvlJc w:val="left"/>
+      <w:pPr>
+        <w:ind w:left="1440" w:hanging="360"/>
+      </w:pPr>
+      <w:rPr>
+        <w:rFonts w:ascii="Courier New" w:hAnsi="Courier New" w:cs="Courier New" w:hint="default"/>
+      </w:rPr>
+    </w:lvl>
+    <w:lvl w:ilvl="2" w:tplc="20000005" w:tentative="1">
+      <w:start w:val="1"/>
+      <w:numFmt w:val="bullet"/>
+      <w:lvlText w:val=""/>
+      <w:lvlJc w:val="left"/>
+      <w:pPr>
+        <w:ind w:left="2160" w:hanging="360"/>
+      </w:pPr>
+      <w:rPr>
+        <w:rFonts w:ascii="Wingdings" w:hAnsi="Wingdings" w:hint="default"/>
+      </w:rPr>
+    </w:lvl>
+    <w:lvl w:ilvl="3" w:tplc="20000001" w:tentative="1">
+      <w:start w:val="1"/>
+      <w:numFmt w:val="bullet"/>
+      <w:lvlText w:val=""/>
+      <w:lvlJc w:val="left"/>
+      <w:pPr>
+        <w:ind w:left="2880" w:hanging="360"/>
+      </w:pPr>
+      <w:rPr>
+        <w:rFonts w:ascii="Symbol" w:hAnsi="Symbol" w:hint="default"/>
+      </w:rPr>
+    </w:lvl>
+    <w:lvl w:ilvl="4" w:tplc="20000003" w:tentative="1">
+      <w:start w:val="1"/>
+      <w:numFmt w:val="bullet"/>
+      <w:lvlText w:val="o"/>
+      <w:lvlJc w:val="left"/>
+      <w:pPr>
+        <w:ind w:left="3600" w:hanging="360"/>
+      </w:pPr>
+      <w:rPr>
+        <w:rFonts w:ascii="Courier New" w:hAnsi="Courier New" w:cs="Courier New" w:hint="default"/>
+      </w:rPr>
+    </w:lvl>
+    <w:lvl w:ilvl="5" w:tplc="20000005" w:tentative="1">
+      <w:start w:val="1"/>
+      <w:numFmt w:val="bullet"/>
+      <w:lvlText w:val=""/>
+      <w:lvlJc w:val="left"/>
+      <w:pPr>
+        <w:ind w:left="4320" w:hanging="360"/>
+      </w:pPr>
+      <w:rPr>
+        <w:rFonts w:ascii="Wingdings" w:hAnsi="Wingdings" w:hint="default"/>
+      </w:rPr>
+    </w:lvl>
+    <w:lvl w:ilvl="6" w:tplc="20000001" w:tentative="1">
+      <w:start w:val="1"/>
+      <w:numFmt w:val="bullet"/>
+      <w:lvlText w:val=""/>
+      <w:lvlJc w:val="left"/>
+      <w:pPr>
+        <w:ind w:left="5040" w:hanging="360"/>
+      </w:pPr>
+      <w:rPr>
+        <w:rFonts w:ascii="Symbol" w:hAnsi="Symbol" w:hint="default"/>
+      </w:rPr>
+    </w:lvl>
+    <w:lvl w:ilvl="7" w:tplc="20000003" w:tentative="1">
+      <w:start w:val="1"/>
+      <w:numFmt w:val="bullet"/>
+      <w:lvlText w:val="o"/>
+      <w:lvlJc w:val="left"/>
+      <w:pPr>
+        <w:ind w:left="5760" w:hanging="360"/>
+      </w:pPr>
+      <w:rPr>
+        <w:rFonts w:ascii="Courier New" w:hAnsi="Courier New" w:cs="Courier New" w:hint="default"/>
+      </w:rPr>
+    </w:lvl>
+    <w:lvl w:ilvl="8" w:tplc="20000005" w:tentative="1">
+      <w:start w:val="1"/>
+      <w:numFmt w:val="bullet"/>
+      <w:lvlText w:val=""/>
+      <w:lvlJc w:val="left"/>
+      <w:pPr>
+        <w:ind w:left="6480" w:hanging="360"/>
+      </w:pPr>
+      <w:rPr>
+        <w:rFonts w:ascii="Wingdings" w:hAnsi="Wingdings" w:hint="default"/>
+      </w:rPr>
+    </w:lvl>
+  </w:abstractNum>
+  <w:abstractNum w:abstractNumId="1" w15:restartNumberingAfterBreak="0">
     <w:nsid w:val="1B8A3B08"/>
     <w:multiLevelType w:val="multilevel"/>
     <w:tmpl w:val="A6802FB2"/>
@@ -1236,7 +1695,120 @@
       </w:rPr>
     </w:lvl>
   </w:abstractNum>
-  <w:abstractNum w:abstractNumId="1" w15:restartNumberingAfterBreak="0">
+  <w:abstractNum w:abstractNumId="2" w15:restartNumberingAfterBreak="0">
+    <w:nsid w:val="3244215F"/>
+    <w:multiLevelType w:val="hybridMultilevel"/>
+    <w:tmpl w:val="EC1482DA"/>
+    <w:lvl w:ilvl="0" w:tplc="20000001">
+      <w:start w:val="1"/>
+      <w:numFmt w:val="bullet"/>
+      <w:lvlText w:val=""/>
+      <w:lvlJc w:val="left"/>
+      <w:pPr>
+        <w:ind w:left="720" w:hanging="360"/>
+      </w:pPr>
+      <w:rPr>
+        <w:rFonts w:ascii="Symbol" w:hAnsi="Symbol" w:hint="default"/>
+      </w:rPr>
+    </w:lvl>
+    <w:lvl w:ilvl="1" w:tplc="20000003" w:tentative="1">
+      <w:start w:val="1"/>
+      <w:numFmt w:val="bullet"/>
+      <w:lvlText w:val="o"/>
+      <w:lvlJc w:val="left"/>
+      <w:pPr>
+        <w:ind w:left="1440" w:hanging="360"/>
+      </w:pPr>
+      <w:rPr>
+        <w:rFonts w:ascii="Courier New" w:hAnsi="Courier New" w:cs="Courier New" w:hint="default"/>
+      </w:rPr>
+    </w:lvl>
+    <w:lvl w:ilvl="2" w:tplc="20000005" w:tentative="1">
+      <w:start w:val="1"/>
+      <w:numFmt w:val="bullet"/>
+      <w:lvlText w:val=""/>
+      <w:lvlJc w:val="left"/>
+      <w:pPr>
+        <w:ind w:left="2160" w:hanging="360"/>
+      </w:pPr>
+      <w:rPr>
+        <w:rFonts w:ascii="Wingdings" w:hAnsi="Wingdings" w:hint="default"/>
+      </w:rPr>
+    </w:lvl>
+    <w:lvl w:ilvl="3" w:tplc="20000001" w:tentative="1">
+      <w:start w:val="1"/>
+      <w:numFmt w:val="bullet"/>
+      <w:lvlText w:val=""/>
+      <w:lvlJc w:val="left"/>
+      <w:pPr>
+        <w:ind w:left="2880" w:hanging="360"/>
+      </w:pPr>
+      <w:rPr>
+        <w:rFonts w:ascii="Symbol" w:hAnsi="Symbol" w:hint="default"/>
+      </w:rPr>
+    </w:lvl>
+    <w:lvl w:ilvl="4" w:tplc="20000003" w:tentative="1">
+      <w:start w:val="1"/>
+      <w:numFmt w:val="bullet"/>
+      <w:lvlText w:val="o"/>
+      <w:lvlJc w:val="left"/>
+      <w:pPr>
+        <w:ind w:left="3600" w:hanging="360"/>
+      </w:pPr>
+      <w:rPr>
+        <w:rFonts w:ascii="Courier New" w:hAnsi="Courier New" w:cs="Courier New" w:hint="default"/>
+      </w:rPr>
+    </w:lvl>
+    <w:lvl w:ilvl="5" w:tplc="20000005" w:tentative="1">
+      <w:start w:val="1"/>
+      <w:numFmt w:val="bullet"/>
+      <w:lvlText w:val=""/>
+      <w:lvlJc w:val="left"/>
+      <w:pPr>
+        <w:ind w:left="4320" w:hanging="360"/>
+      </w:pPr>
+      <w:rPr>
+        <w:rFonts w:ascii="Wingdings" w:hAnsi="Wingdings" w:hint="default"/>
+      </w:rPr>
+    </w:lvl>
+    <w:lvl w:ilvl="6" w:tplc="20000001" w:tentative="1">
+      <w:start w:val="1"/>
+      <w:numFmt w:val="bullet"/>
+      <w:lvlText w:val=""/>
+      <w:lvlJc w:val="left"/>
+      <w:pPr>
+        <w:ind w:left="5040" w:hanging="360"/>
+      </w:pPr>
+      <w:rPr>
+        <w:rFonts w:ascii="Symbol" w:hAnsi="Symbol" w:hint="default"/>
+      </w:rPr>
+    </w:lvl>
+    <w:lvl w:ilvl="7" w:tplc="20000003" w:tentative="1">
+      <w:start w:val="1"/>
+      <w:numFmt w:val="bullet"/>
+      <w:lvlText w:val="o"/>
+      <w:lvlJc w:val="left"/>
+      <w:pPr>
+        <w:ind w:left="5760" w:hanging="360"/>
+      </w:pPr>
+      <w:rPr>
+        <w:rFonts w:ascii="Courier New" w:hAnsi="Courier New" w:cs="Courier New" w:hint="default"/>
+      </w:rPr>
+    </w:lvl>
+    <w:lvl w:ilvl="8" w:tplc="20000005" w:tentative="1">
+      <w:start w:val="1"/>
+      <w:numFmt w:val="bullet"/>
+      <w:lvlText w:val=""/>
+      <w:lvlJc w:val="left"/>
+      <w:pPr>
+        <w:ind w:left="6480" w:hanging="360"/>
+      </w:pPr>
+      <w:rPr>
+        <w:rFonts w:ascii="Wingdings" w:hAnsi="Wingdings" w:hint="default"/>
+      </w:rPr>
+    </w:lvl>
+  </w:abstractNum>
+  <w:abstractNum w:abstractNumId="3" w15:restartNumberingAfterBreak="0">
     <w:nsid w:val="45F046DC"/>
     <w:multiLevelType w:val="multilevel"/>
     <w:tmpl w:val="743A3692"/>
@@ -1385,7 +1957,269 @@
       </w:rPr>
     </w:lvl>
   </w:abstractNum>
-  <w:abstractNum w:abstractNumId="2" w15:restartNumberingAfterBreak="0">
+  <w:abstractNum w:abstractNumId="4" w15:restartNumberingAfterBreak="0">
+    <w:nsid w:val="537616B3"/>
+    <w:multiLevelType w:val="multilevel"/>
+    <w:tmpl w:val="16BED3BA"/>
+    <w:lvl w:ilvl="0">
+      <w:start w:val="1"/>
+      <w:numFmt w:val="bullet"/>
+      <w:lvlText w:val=""/>
+      <w:lvlJc w:val="left"/>
+      <w:pPr>
+        <w:tabs>
+          <w:tab w:val="num" w:pos="720"/>
+        </w:tabs>
+        <w:ind w:left="720" w:hanging="360"/>
+      </w:pPr>
+      <w:rPr>
+        <w:rFonts w:ascii="Symbol" w:hAnsi="Symbol" w:hint="default"/>
+        <w:sz w:val="20"/>
+      </w:rPr>
+    </w:lvl>
+    <w:lvl w:ilvl="1" w:tentative="1">
+      <w:start w:val="1"/>
+      <w:numFmt w:val="bullet"/>
+      <w:lvlText w:val="o"/>
+      <w:lvlJc w:val="left"/>
+      <w:pPr>
+        <w:tabs>
+          <w:tab w:val="num" w:pos="1440"/>
+        </w:tabs>
+        <w:ind w:left="1440" w:hanging="360"/>
+      </w:pPr>
+      <w:rPr>
+        <w:rFonts w:ascii="Courier New" w:hAnsi="Courier New" w:hint="default"/>
+        <w:sz w:val="20"/>
+      </w:rPr>
+    </w:lvl>
+    <w:lvl w:ilvl="2" w:tentative="1">
+      <w:start w:val="1"/>
+      <w:numFmt w:val="bullet"/>
+      <w:lvlText w:val=""/>
+      <w:lvlJc w:val="left"/>
+      <w:pPr>
+        <w:tabs>
+          <w:tab w:val="num" w:pos="2160"/>
+        </w:tabs>
+        <w:ind w:left="2160" w:hanging="360"/>
+      </w:pPr>
+      <w:rPr>
+        <w:rFonts w:ascii="Wingdings" w:hAnsi="Wingdings" w:hint="default"/>
+        <w:sz w:val="20"/>
+      </w:rPr>
+    </w:lvl>
+    <w:lvl w:ilvl="3" w:tentative="1">
+      <w:start w:val="1"/>
+      <w:numFmt w:val="bullet"/>
+      <w:lvlText w:val=""/>
+      <w:lvlJc w:val="left"/>
+      <w:pPr>
+        <w:tabs>
+          <w:tab w:val="num" w:pos="2880"/>
+        </w:tabs>
+        <w:ind w:left="2880" w:hanging="360"/>
+      </w:pPr>
+      <w:rPr>
+        <w:rFonts w:ascii="Wingdings" w:hAnsi="Wingdings" w:hint="default"/>
+        <w:sz w:val="20"/>
+      </w:rPr>
+    </w:lvl>
+    <w:lvl w:ilvl="4" w:tentative="1">
+      <w:start w:val="1"/>
+      <w:numFmt w:val="bullet"/>
+      <w:lvlText w:val=""/>
+      <w:lvlJc w:val="left"/>
+      <w:pPr>
+        <w:tabs>
+          <w:tab w:val="num" w:pos="3600"/>
+        </w:tabs>
+        <w:ind w:left="3600" w:hanging="360"/>
+      </w:pPr>
+      <w:rPr>
+        <w:rFonts w:ascii="Wingdings" w:hAnsi="Wingdings" w:hint="default"/>
+        <w:sz w:val="20"/>
+      </w:rPr>
+    </w:lvl>
+    <w:lvl w:ilvl="5" w:tentative="1">
+      <w:start w:val="1"/>
+      <w:numFmt w:val="bullet"/>
+      <w:lvlText w:val=""/>
+      <w:lvlJc w:val="left"/>
+      <w:pPr>
+        <w:tabs>
+          <w:tab w:val="num" w:pos="4320"/>
+        </w:tabs>
+        <w:ind w:left="4320" w:hanging="360"/>
+      </w:pPr>
+      <w:rPr>
+        <w:rFonts w:ascii="Wingdings" w:hAnsi="Wingdings" w:hint="default"/>
+        <w:sz w:val="20"/>
+      </w:rPr>
+    </w:lvl>
+    <w:lvl w:ilvl="6" w:tentative="1">
+      <w:start w:val="1"/>
+      <w:numFmt w:val="bullet"/>
+      <w:lvlText w:val=""/>
+      <w:lvlJc w:val="left"/>
+      <w:pPr>
+        <w:tabs>
+          <w:tab w:val="num" w:pos="5040"/>
+        </w:tabs>
+        <w:ind w:left="5040" w:hanging="360"/>
+      </w:pPr>
+      <w:rPr>
+        <w:rFonts w:ascii="Wingdings" w:hAnsi="Wingdings" w:hint="default"/>
+        <w:sz w:val="20"/>
+      </w:rPr>
+    </w:lvl>
+    <w:lvl w:ilvl="7" w:tentative="1">
+      <w:start w:val="1"/>
+      <w:numFmt w:val="bullet"/>
+      <w:lvlText w:val=""/>
+      <w:lvlJc w:val="left"/>
+      <w:pPr>
+        <w:tabs>
+          <w:tab w:val="num" w:pos="5760"/>
+        </w:tabs>
+        <w:ind w:left="5760" w:hanging="360"/>
+      </w:pPr>
+      <w:rPr>
+        <w:rFonts w:ascii="Wingdings" w:hAnsi="Wingdings" w:hint="default"/>
+        <w:sz w:val="20"/>
+      </w:rPr>
+    </w:lvl>
+    <w:lvl w:ilvl="8" w:tentative="1">
+      <w:start w:val="1"/>
+      <w:numFmt w:val="bullet"/>
+      <w:lvlText w:val=""/>
+      <w:lvlJc w:val="left"/>
+      <w:pPr>
+        <w:tabs>
+          <w:tab w:val="num" w:pos="6480"/>
+        </w:tabs>
+        <w:ind w:left="6480" w:hanging="360"/>
+      </w:pPr>
+      <w:rPr>
+        <w:rFonts w:ascii="Wingdings" w:hAnsi="Wingdings" w:hint="default"/>
+        <w:sz w:val="20"/>
+      </w:rPr>
+    </w:lvl>
+  </w:abstractNum>
+  <w:abstractNum w:abstractNumId="5" w15:restartNumberingAfterBreak="0">
+    <w:nsid w:val="588063A9"/>
+    <w:multiLevelType w:val="hybridMultilevel"/>
+    <w:tmpl w:val="CB507A6C"/>
+    <w:lvl w:ilvl="0" w:tplc="20000001">
+      <w:start w:val="1"/>
+      <w:numFmt w:val="bullet"/>
+      <w:lvlText w:val=""/>
+      <w:lvlJc w:val="left"/>
+      <w:pPr>
+        <w:ind w:left="720" w:hanging="360"/>
+      </w:pPr>
+      <w:rPr>
+        <w:rFonts w:ascii="Symbol" w:hAnsi="Symbol" w:hint="default"/>
+      </w:rPr>
+    </w:lvl>
+    <w:lvl w:ilvl="1" w:tplc="20000003">
+      <w:start w:val="1"/>
+      <w:numFmt w:val="bullet"/>
+      <w:lvlText w:val="o"/>
+      <w:lvlJc w:val="left"/>
+      <w:pPr>
+        <w:ind w:left="1440" w:hanging="360"/>
+      </w:pPr>
+      <w:rPr>
+        <w:rFonts w:ascii="Courier New" w:hAnsi="Courier New" w:cs="Courier New" w:hint="default"/>
+      </w:rPr>
+    </w:lvl>
+    <w:lvl w:ilvl="2" w:tplc="20000005" w:tentative="1">
+      <w:start w:val="1"/>
+      <w:numFmt w:val="bullet"/>
+      <w:lvlText w:val=""/>
+      <w:lvlJc w:val="left"/>
+      <w:pPr>
+        <w:ind w:left="2160" w:hanging="360"/>
+      </w:pPr>
+      <w:rPr>
+        <w:rFonts w:ascii="Wingdings" w:hAnsi="Wingdings" w:hint="default"/>
+      </w:rPr>
+    </w:lvl>
+    <w:lvl w:ilvl="3" w:tplc="20000001" w:tentative="1">
+      <w:start w:val="1"/>
+      <w:numFmt w:val="bullet"/>
+      <w:lvlText w:val=""/>
+      <w:lvlJc w:val="left"/>
+      <w:pPr>
+        <w:ind w:left="2880" w:hanging="360"/>
+      </w:pPr>
+      <w:rPr>
+        <w:rFonts w:ascii="Symbol" w:hAnsi="Symbol" w:hint="default"/>
+      </w:rPr>
+    </w:lvl>
+    <w:lvl w:ilvl="4" w:tplc="20000003" w:tentative="1">
+      <w:start w:val="1"/>
+      <w:numFmt w:val="bullet"/>
+      <w:lvlText w:val="o"/>
+      <w:lvlJc w:val="left"/>
+      <w:pPr>
+        <w:ind w:left="3600" w:hanging="360"/>
+      </w:pPr>
+      <w:rPr>
+        <w:rFonts w:ascii="Courier New" w:hAnsi="Courier New" w:cs="Courier New" w:hint="default"/>
+      </w:rPr>
+    </w:lvl>
+    <w:lvl w:ilvl="5" w:tplc="20000005" w:tentative="1">
+      <w:start w:val="1"/>
+      <w:numFmt w:val="bullet"/>
+      <w:lvlText w:val=""/>
+      <w:lvlJc w:val="left"/>
+      <w:pPr>
+        <w:ind w:left="4320" w:hanging="360"/>
+      </w:pPr>
+      <w:rPr>
+        <w:rFonts w:ascii="Wingdings" w:hAnsi="Wingdings" w:hint="default"/>
+      </w:rPr>
+    </w:lvl>
+    <w:lvl w:ilvl="6" w:tplc="20000001" w:tentative="1">
+      <w:start w:val="1"/>
+      <w:numFmt w:val="bullet"/>
+      <w:lvlText w:val=""/>
+      <w:lvlJc w:val="left"/>
+      <w:pPr>
+        <w:ind w:left="5040" w:hanging="360"/>
+      </w:pPr>
+      <w:rPr>
+        <w:rFonts w:ascii="Symbol" w:hAnsi="Symbol" w:hint="default"/>
+      </w:rPr>
+    </w:lvl>
+    <w:lvl w:ilvl="7" w:tplc="20000003" w:tentative="1">
+      <w:start w:val="1"/>
+      <w:numFmt w:val="bullet"/>
+      <w:lvlText w:val="o"/>
+      <w:lvlJc w:val="left"/>
+      <w:pPr>
+        <w:ind w:left="5760" w:hanging="360"/>
+      </w:pPr>
+      <w:rPr>
+        <w:rFonts w:ascii="Courier New" w:hAnsi="Courier New" w:cs="Courier New" w:hint="default"/>
+      </w:rPr>
+    </w:lvl>
+    <w:lvl w:ilvl="8" w:tplc="20000005" w:tentative="1">
+      <w:start w:val="1"/>
+      <w:numFmt w:val="bullet"/>
+      <w:lvlText w:val=""/>
+      <w:lvlJc w:val="left"/>
+      <w:pPr>
+        <w:ind w:left="6480" w:hanging="360"/>
+      </w:pPr>
+      <w:rPr>
+        <w:rFonts w:ascii="Wingdings" w:hAnsi="Wingdings" w:hint="default"/>
+      </w:rPr>
+    </w:lvl>
+  </w:abstractNum>
+  <w:abstractNum w:abstractNumId="6" w15:restartNumberingAfterBreak="0">
     <w:nsid w:val="65D72AC9"/>
     <w:multiLevelType w:val="multilevel"/>
     <w:tmpl w:val="464E835E"/>
@@ -1534,7 +2368,7 @@
       </w:rPr>
     </w:lvl>
   </w:abstractNum>
-  <w:abstractNum w:abstractNumId="3" w15:restartNumberingAfterBreak="0">
+  <w:abstractNum w:abstractNumId="7" w15:restartNumberingAfterBreak="0">
     <w:nsid w:val="69117CCE"/>
     <w:multiLevelType w:val="multilevel"/>
     <w:tmpl w:val="97D8D7D4"/>
@@ -1683,7 +2517,7 @@
       </w:rPr>
     </w:lvl>
   </w:abstractNum>
-  <w:abstractNum w:abstractNumId="4" w15:restartNumberingAfterBreak="0">
+  <w:abstractNum w:abstractNumId="8" w15:restartNumberingAfterBreak="0">
     <w:nsid w:val="6CAC645C"/>
     <w:multiLevelType w:val="multilevel"/>
     <w:tmpl w:val="EF1EDE90"/>
@@ -1832,7 +2666,7 @@
       </w:rPr>
     </w:lvl>
   </w:abstractNum>
-  <w:abstractNum w:abstractNumId="5" w15:restartNumberingAfterBreak="0">
+  <w:abstractNum w:abstractNumId="9" w15:restartNumberingAfterBreak="0">
     <w:nsid w:val="71CF602F"/>
     <w:multiLevelType w:val="multilevel"/>
     <w:tmpl w:val="5C1E5F68"/>
@@ -1981,22 +2815,266 @@
       </w:rPr>
     </w:lvl>
   </w:abstractNum>
+  <w:abstractNum w:abstractNumId="10" w15:restartNumberingAfterBreak="0">
+    <w:nsid w:val="732366C0"/>
+    <w:multiLevelType w:val="hybridMultilevel"/>
+    <w:tmpl w:val="A63A9616"/>
+    <w:lvl w:ilvl="0" w:tplc="20000001">
+      <w:start w:val="1"/>
+      <w:numFmt w:val="bullet"/>
+      <w:lvlText w:val=""/>
+      <w:lvlJc w:val="left"/>
+      <w:pPr>
+        <w:ind w:left="720" w:hanging="360"/>
+      </w:pPr>
+      <w:rPr>
+        <w:rFonts w:ascii="Symbol" w:hAnsi="Symbol" w:hint="default"/>
+      </w:rPr>
+    </w:lvl>
+    <w:lvl w:ilvl="1" w:tplc="20000003" w:tentative="1">
+      <w:start w:val="1"/>
+      <w:numFmt w:val="bullet"/>
+      <w:lvlText w:val="o"/>
+      <w:lvlJc w:val="left"/>
+      <w:pPr>
+        <w:ind w:left="1440" w:hanging="360"/>
+      </w:pPr>
+      <w:rPr>
+        <w:rFonts w:ascii="Courier New" w:hAnsi="Courier New" w:cs="Courier New" w:hint="default"/>
+      </w:rPr>
+    </w:lvl>
+    <w:lvl w:ilvl="2" w:tplc="20000005" w:tentative="1">
+      <w:start w:val="1"/>
+      <w:numFmt w:val="bullet"/>
+      <w:lvlText w:val=""/>
+      <w:lvlJc w:val="left"/>
+      <w:pPr>
+        <w:ind w:left="2160" w:hanging="360"/>
+      </w:pPr>
+      <w:rPr>
+        <w:rFonts w:ascii="Wingdings" w:hAnsi="Wingdings" w:hint="default"/>
+      </w:rPr>
+    </w:lvl>
+    <w:lvl w:ilvl="3" w:tplc="20000001" w:tentative="1">
+      <w:start w:val="1"/>
+      <w:numFmt w:val="bullet"/>
+      <w:lvlText w:val=""/>
+      <w:lvlJc w:val="left"/>
+      <w:pPr>
+        <w:ind w:left="2880" w:hanging="360"/>
+      </w:pPr>
+      <w:rPr>
+        <w:rFonts w:ascii="Symbol" w:hAnsi="Symbol" w:hint="default"/>
+      </w:rPr>
+    </w:lvl>
+    <w:lvl w:ilvl="4" w:tplc="20000003" w:tentative="1">
+      <w:start w:val="1"/>
+      <w:numFmt w:val="bullet"/>
+      <w:lvlText w:val="o"/>
+      <w:lvlJc w:val="left"/>
+      <w:pPr>
+        <w:ind w:left="3600" w:hanging="360"/>
+      </w:pPr>
+      <w:rPr>
+        <w:rFonts w:ascii="Courier New" w:hAnsi="Courier New" w:cs="Courier New" w:hint="default"/>
+      </w:rPr>
+    </w:lvl>
+    <w:lvl w:ilvl="5" w:tplc="20000005" w:tentative="1">
+      <w:start w:val="1"/>
+      <w:numFmt w:val="bullet"/>
+      <w:lvlText w:val=""/>
+      <w:lvlJc w:val="left"/>
+      <w:pPr>
+        <w:ind w:left="4320" w:hanging="360"/>
+      </w:pPr>
+      <w:rPr>
+        <w:rFonts w:ascii="Wingdings" w:hAnsi="Wingdings" w:hint="default"/>
+      </w:rPr>
+    </w:lvl>
+    <w:lvl w:ilvl="6" w:tplc="20000001" w:tentative="1">
+      <w:start w:val="1"/>
+      <w:numFmt w:val="bullet"/>
+      <w:lvlText w:val=""/>
+      <w:lvlJc w:val="left"/>
+      <w:pPr>
+        <w:ind w:left="5040" w:hanging="360"/>
+      </w:pPr>
+      <w:rPr>
+        <w:rFonts w:ascii="Symbol" w:hAnsi="Symbol" w:hint="default"/>
+      </w:rPr>
+    </w:lvl>
+    <w:lvl w:ilvl="7" w:tplc="20000003" w:tentative="1">
+      <w:start w:val="1"/>
+      <w:numFmt w:val="bullet"/>
+      <w:lvlText w:val="o"/>
+      <w:lvlJc w:val="left"/>
+      <w:pPr>
+        <w:ind w:left="5760" w:hanging="360"/>
+      </w:pPr>
+      <w:rPr>
+        <w:rFonts w:ascii="Courier New" w:hAnsi="Courier New" w:cs="Courier New" w:hint="default"/>
+      </w:rPr>
+    </w:lvl>
+    <w:lvl w:ilvl="8" w:tplc="20000005" w:tentative="1">
+      <w:start w:val="1"/>
+      <w:numFmt w:val="bullet"/>
+      <w:lvlText w:val=""/>
+      <w:lvlJc w:val="left"/>
+      <w:pPr>
+        <w:ind w:left="6480" w:hanging="360"/>
+      </w:pPr>
+      <w:rPr>
+        <w:rFonts w:ascii="Wingdings" w:hAnsi="Wingdings" w:hint="default"/>
+      </w:rPr>
+    </w:lvl>
+  </w:abstractNum>
+  <w:abstractNum w:abstractNumId="11" w15:restartNumberingAfterBreak="0">
+    <w:nsid w:val="74F40158"/>
+    <w:multiLevelType w:val="hybridMultilevel"/>
+    <w:tmpl w:val="4C781D32"/>
+    <w:lvl w:ilvl="0" w:tplc="20000001">
+      <w:start w:val="1"/>
+      <w:numFmt w:val="bullet"/>
+      <w:lvlText w:val=""/>
+      <w:lvlJc w:val="left"/>
+      <w:pPr>
+        <w:ind w:left="720" w:hanging="360"/>
+      </w:pPr>
+      <w:rPr>
+        <w:rFonts w:ascii="Symbol" w:hAnsi="Symbol" w:hint="default"/>
+      </w:rPr>
+    </w:lvl>
+    <w:lvl w:ilvl="1" w:tplc="20000003" w:tentative="1">
+      <w:start w:val="1"/>
+      <w:numFmt w:val="bullet"/>
+      <w:lvlText w:val="o"/>
+      <w:lvlJc w:val="left"/>
+      <w:pPr>
+        <w:ind w:left="1440" w:hanging="360"/>
+      </w:pPr>
+      <w:rPr>
+        <w:rFonts w:ascii="Courier New" w:hAnsi="Courier New" w:cs="Courier New" w:hint="default"/>
+      </w:rPr>
+    </w:lvl>
+    <w:lvl w:ilvl="2" w:tplc="20000005" w:tentative="1">
+      <w:start w:val="1"/>
+      <w:numFmt w:val="bullet"/>
+      <w:lvlText w:val=""/>
+      <w:lvlJc w:val="left"/>
+      <w:pPr>
+        <w:ind w:left="2160" w:hanging="360"/>
+      </w:pPr>
+      <w:rPr>
+        <w:rFonts w:ascii="Wingdings" w:hAnsi="Wingdings" w:hint="default"/>
+      </w:rPr>
+    </w:lvl>
+    <w:lvl w:ilvl="3" w:tplc="20000001" w:tentative="1">
+      <w:start w:val="1"/>
+      <w:numFmt w:val="bullet"/>
+      <w:lvlText w:val=""/>
+      <w:lvlJc w:val="left"/>
+      <w:pPr>
+        <w:ind w:left="2880" w:hanging="360"/>
+      </w:pPr>
+      <w:rPr>
+        <w:rFonts w:ascii="Symbol" w:hAnsi="Symbol" w:hint="default"/>
+      </w:rPr>
+    </w:lvl>
+    <w:lvl w:ilvl="4" w:tplc="20000003" w:tentative="1">
+      <w:start w:val="1"/>
+      <w:numFmt w:val="bullet"/>
+      <w:lvlText w:val="o"/>
+      <w:lvlJc w:val="left"/>
+      <w:pPr>
+        <w:ind w:left="3600" w:hanging="360"/>
+      </w:pPr>
+      <w:rPr>
+        <w:rFonts w:ascii="Courier New" w:hAnsi="Courier New" w:cs="Courier New" w:hint="default"/>
+      </w:rPr>
+    </w:lvl>
+    <w:lvl w:ilvl="5" w:tplc="20000005" w:tentative="1">
+      <w:start w:val="1"/>
+      <w:numFmt w:val="bullet"/>
+      <w:lvlText w:val=""/>
+      <w:lvlJc w:val="left"/>
+      <w:pPr>
+        <w:ind w:left="4320" w:hanging="360"/>
+      </w:pPr>
+      <w:rPr>
+        <w:rFonts w:ascii="Wingdings" w:hAnsi="Wingdings" w:hint="default"/>
+      </w:rPr>
+    </w:lvl>
+    <w:lvl w:ilvl="6" w:tplc="20000001" w:tentative="1">
+      <w:start w:val="1"/>
+      <w:numFmt w:val="bullet"/>
+      <w:lvlText w:val=""/>
+      <w:lvlJc w:val="left"/>
+      <w:pPr>
+        <w:ind w:left="5040" w:hanging="360"/>
+      </w:pPr>
+      <w:rPr>
+        <w:rFonts w:ascii="Symbol" w:hAnsi="Symbol" w:hint="default"/>
+      </w:rPr>
+    </w:lvl>
+    <w:lvl w:ilvl="7" w:tplc="20000003" w:tentative="1">
+      <w:start w:val="1"/>
+      <w:numFmt w:val="bullet"/>
+      <w:lvlText w:val="o"/>
+      <w:lvlJc w:val="left"/>
+      <w:pPr>
+        <w:ind w:left="5760" w:hanging="360"/>
+      </w:pPr>
+      <w:rPr>
+        <w:rFonts w:ascii="Courier New" w:hAnsi="Courier New" w:cs="Courier New" w:hint="default"/>
+      </w:rPr>
+    </w:lvl>
+    <w:lvl w:ilvl="8" w:tplc="20000005" w:tentative="1">
+      <w:start w:val="1"/>
+      <w:numFmt w:val="bullet"/>
+      <w:lvlText w:val=""/>
+      <w:lvlJc w:val="left"/>
+      <w:pPr>
+        <w:ind w:left="6480" w:hanging="360"/>
+      </w:pPr>
+      <w:rPr>
+        <w:rFonts w:ascii="Wingdings" w:hAnsi="Wingdings" w:hint="default"/>
+      </w:rPr>
+    </w:lvl>
+  </w:abstractNum>
   <w:num w:numId="1" w16cid:durableId="1806045158">
+    <w:abstractNumId w:val="8"/>
+  </w:num>
+  <w:num w:numId="2" w16cid:durableId="103042691">
+    <w:abstractNumId w:val="1"/>
+  </w:num>
+  <w:num w:numId="3" w16cid:durableId="2019572738">
+    <w:abstractNumId w:val="3"/>
+  </w:num>
+  <w:num w:numId="4" w16cid:durableId="546524874">
+    <w:abstractNumId w:val="6"/>
+  </w:num>
+  <w:num w:numId="5" w16cid:durableId="1085030390">
+    <w:abstractNumId w:val="7"/>
+  </w:num>
+  <w:num w:numId="6" w16cid:durableId="1375303706">
+    <w:abstractNumId w:val="9"/>
+  </w:num>
+  <w:num w:numId="7" w16cid:durableId="108357187">
     <w:abstractNumId w:val="4"/>
   </w:num>
-  <w:num w:numId="2" w16cid:durableId="103042691">
+  <w:num w:numId="8" w16cid:durableId="5715308">
+    <w:abstractNumId w:val="2"/>
+  </w:num>
+  <w:num w:numId="9" w16cid:durableId="2108382710">
+    <w:abstractNumId w:val="11"/>
+  </w:num>
+  <w:num w:numId="10" w16cid:durableId="344749206">
+    <w:abstractNumId w:val="10"/>
+  </w:num>
+  <w:num w:numId="11" w16cid:durableId="186256994">
     <w:abstractNumId w:val="0"/>
   </w:num>
-  <w:num w:numId="3" w16cid:durableId="2019572738">
-    <w:abstractNumId w:val="1"/>
-  </w:num>
-  <w:num w:numId="4" w16cid:durableId="546524874">
-    <w:abstractNumId w:val="2"/>
-  </w:num>
-  <w:num w:numId="5" w16cid:durableId="1085030390">
-    <w:abstractNumId w:val="3"/>
-  </w:num>
-  <w:num w:numId="6" w16cid:durableId="1375303706">
+  <w:num w:numId="12" w16cid:durableId="1245918997">
     <w:abstractNumId w:val="5"/>
   </w:num>
 </w:numbering>

</xml_diff>